<commit_message>
Add 9 bank scrutiny report templates with field manifests, notes and field-name unification
Docxtpl templates converted from the 10 source reports (two Tata Capital reports share one), each with a .fields.json manifest (review_level must_confirm|glance), field_aliases.json for merged/renamed fields, prep notes and the unification proposal. Raw client reports stay untracked.

Co-Authored-By: Claude Sonnet 5.5 <noreply@anthropic.com>
</commit_message>
<xml_diff>
--- a/backend/templates/scrutiny_reports/idfc-first-bank-title-report.docx
+++ b/backend/templates/scrutiny_reports/idfc-first-bank-title-report.docx
@@ -783,767 +783,41 @@
                 <w:sz w:val="24"/>
                 <w:szCs w:val="24"/>
               </w:rPr>
-              <w:t>Sole Proprietorship    Partnership       Trust</w:t>
+              <w:t xml:space="preserve">{{ '☒' if (borrower_nature|lower) == 'sole proprietorship' else '☐' }} Sole Proprietorship    {{ '☒' if (borrower_nature|lower) == 'partnership' else '☐' }} Partnership    {{ '☒' if (borrower_nature|lower) == 'trust' else '☐' }} Trust</w:t>
             </w:r>
           </w:p>
           <w:p>
             <w:pPr>
               <w:spacing w:after="0" w:line="240" w:lineRule="auto"/>
-              <w:rPr>
-                <w:sz w:val="24"/>
-                <w:szCs w:val="24"/>
-              </w:rPr>
-            </w:pPr>
-            <w:r>
-              <w:rPr>
-                <w:noProof/>
-                <w:sz w:val="24"/>
-                <w:szCs w:val="24"/>
-                <w:lang w:val="en-IN" w:eastAsia="en-IN"/>
-              </w:rPr>
-              <mc:AlternateContent>
-                <mc:Choice Requires="wps">
-                  <w:drawing>
-                    <wp:anchor distT="0" distB="0" distL="114300" distR="114300" simplePos="0" relativeHeight="251663360" behindDoc="0" locked="0" layoutInCell="1" allowOverlap="1" wp14:anchorId="4CFBE0B5" wp14:editId="6FF73D8F">
-                      <wp:simplePos x="0" y="0"/>
-                      <wp:positionH relativeFrom="column">
-                        <wp:posOffset>2465070</wp:posOffset>
-                      </wp:positionH>
-                      <wp:positionV relativeFrom="paragraph">
-                        <wp:posOffset>2540</wp:posOffset>
-                      </wp:positionV>
-                      <wp:extent cx="161925" cy="90805"/>
-                      <wp:effectExtent l="7620" t="12065" r="11430" b="11430"/>
-                      <wp:wrapNone/>
-                      <wp:docPr id="153793429" name="Rectangle 28"/>
-                      <wp:cNvGraphicFramePr>
-                        <a:graphicFrameLocks xmlns:a="http://schemas.openxmlformats.org/drawingml/2006/main"/>
-                      </wp:cNvGraphicFramePr>
-                      <a:graphic xmlns:a="http://schemas.openxmlformats.org/drawingml/2006/main">
-                        <a:graphicData uri="http://schemas.microsoft.com/office/word/2010/wordprocessingShape">
-                          <wps:wsp>
-                            <wps:cNvSpPr>
-                              <a:spLocks noChangeArrowheads="1"/>
-                            </wps:cNvSpPr>
-                            <wps:spPr bwMode="auto">
-                              <a:xfrm>
-                                <a:off x="0" y="0"/>
-                                <a:ext cx="161925" cy="90805"/>
-                              </a:xfrm>
-                              <a:prstGeom prst="rect">
-                                <a:avLst/>
-                              </a:prstGeom>
-                              <a:solidFill>
-                                <a:srgbClr val="FFFFFF"/>
-                              </a:solidFill>
-                              <a:ln w="9525">
-                                <a:solidFill>
-                                  <a:srgbClr val="000000"/>
-                                </a:solidFill>
-                                <a:miter lim="800000"/>
-                                <a:headEnd/>
-                                <a:tailEnd/>
-                              </a:ln>
-                            </wps:spPr>
-                            <wps:txbx>
-                              <w:txbxContent>
-                                <w:p/>
-                              </w:txbxContent>
-                            </wps:txbx>
-                            <wps:bodyPr rot="0" vert="horz" wrap="square" lIns="91440" tIns="45720" rIns="91440" bIns="45720" anchor="t" anchorCtr="0" upright="1">
-                              <a:noAutofit/>
-                            </wps:bodyPr>
-                          </wps:wsp>
-                        </a:graphicData>
-                      </a:graphic>
-                      <wp14:sizeRelH relativeFrom="page">
-                        <wp14:pctWidth>0</wp14:pctWidth>
-                      </wp14:sizeRelH>
-                      <wp14:sizeRelV relativeFrom="page">
-                        <wp14:pctHeight>0</wp14:pctHeight>
-                      </wp14:sizeRelV>
-                    </wp:anchor>
-                  </w:drawing>
-                </mc:Choice>
-                <mc:Fallback xmlns:w16sdtfl="http://schemas.microsoft.com/office/word/2024/wordml/sdtformatlock" xmlns:w16sdtdh="http://schemas.microsoft.com/office/word/2020/wordml/sdtdatahash" xmlns:w16du="http://schemas.microsoft.com/office/word/2023/wordml/word16du" xmlns:w16="http://schemas.microsoft.com/office/word/2018/wordml" xmlns:w16cex="http://schemas.microsoft.com/office/word/2018/wordml/cex" xmlns:oel="http://schemas.microsoft.com/office/2019/extlst">
-                  <w:pict>
-                    <v:rect w14:anchorId="4CFBE0B5" id="Rectangle 28" o:spid="_x0000_s1026" style="position:absolute;left:0;text-align:left;margin-left:194.1pt;margin-top:.2pt;width:12.75pt;height:7.15pt;z-index:251663360;visibility:visible;mso-wrap-style:square;mso-width-percent:0;mso-height-percent:0;mso-wrap-distance-left:9pt;mso-wrap-distance-top:0;mso-wrap-distance-right:9pt;mso-wrap-distance-bottom:0;mso-position-horizontal:absolute;mso-position-horizontal-relative:text;mso-position-vertical:absolute;mso-position-vertical-relative:text;mso-width-percent:0;mso-height-percent:0;mso-width-relative:page;mso-height-relative:page;v-text-anchor:top" o:gfxdata="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">
-                      <v:textbox>
-                        <w:txbxContent>
-                          <w:p/>
-                        </w:txbxContent>
-                      </v:textbox>
-                    </v:rect>
-                  </w:pict>
-                </mc:Fallback>
-              </mc:AlternateContent>
-            </w:r>
-            <w:r>
-              <w:rPr>
-                <w:noProof/>
-                <w:sz w:val="24"/>
-                <w:szCs w:val="24"/>
-                <w:lang w:val="en-IN" w:eastAsia="en-IN"/>
-              </w:rPr>
-              <mc:AlternateContent>
-                <mc:Choice Requires="wps">
-                  <w:drawing>
-                    <wp:anchor distT="0" distB="0" distL="114300" distR="114300" simplePos="0" relativeHeight="251660288" behindDoc="0" locked="0" layoutInCell="1" allowOverlap="1" wp14:anchorId="75E86521" wp14:editId="7D8CB6FB">
-                      <wp:simplePos x="0" y="0"/>
-                      <wp:positionH relativeFrom="column">
-                        <wp:posOffset>1617345</wp:posOffset>
-                      </wp:positionH>
-                      <wp:positionV relativeFrom="paragraph">
-                        <wp:posOffset>2540</wp:posOffset>
-                      </wp:positionV>
-                      <wp:extent cx="161925" cy="90805"/>
-                      <wp:effectExtent l="7620" t="12065" r="11430" b="11430"/>
-                      <wp:wrapNone/>
-                      <wp:docPr id="1544537587" name="Rectangle 27"/>
-                      <wp:cNvGraphicFramePr>
-                        <a:graphicFrameLocks xmlns:a="http://schemas.openxmlformats.org/drawingml/2006/main"/>
-                      </wp:cNvGraphicFramePr>
-                      <a:graphic xmlns:a="http://schemas.openxmlformats.org/drawingml/2006/main">
-                        <a:graphicData uri="http://schemas.microsoft.com/office/word/2010/wordprocessingShape">
-                          <wps:wsp>
-                            <wps:cNvSpPr>
-                              <a:spLocks noChangeArrowheads="1"/>
-                            </wps:cNvSpPr>
-                            <wps:spPr bwMode="auto">
-                              <a:xfrm>
-                                <a:off x="0" y="0"/>
-                                <a:ext cx="161925" cy="90805"/>
-                              </a:xfrm>
-                              <a:prstGeom prst="rect">
-                                <a:avLst/>
-                              </a:prstGeom>
-                              <a:solidFill>
-                                <a:srgbClr val="FFFFFF"/>
-                              </a:solidFill>
-                              <a:ln w="9525">
-                                <a:solidFill>
-                                  <a:srgbClr val="000000"/>
-                                </a:solidFill>
-                                <a:miter lim="800000"/>
-                                <a:headEnd/>
-                                <a:tailEnd/>
-                              </a:ln>
-                            </wps:spPr>
-                            <wps:txbx>
-                              <w:txbxContent>
-                                <w:p/>
-                              </w:txbxContent>
-                            </wps:txbx>
-                            <wps:bodyPr rot="0" vert="horz" wrap="square" lIns="91440" tIns="45720" rIns="91440" bIns="45720" anchor="t" anchorCtr="0" upright="1">
-                              <a:noAutofit/>
-                            </wps:bodyPr>
-                          </wps:wsp>
-                        </a:graphicData>
-                      </a:graphic>
-                      <wp14:sizeRelH relativeFrom="page">
-                        <wp14:pctWidth>0</wp14:pctWidth>
-                      </wp14:sizeRelH>
-                      <wp14:sizeRelV relativeFrom="page">
-                        <wp14:pctHeight>0</wp14:pctHeight>
-                      </wp14:sizeRelV>
-                    </wp:anchor>
-                  </w:drawing>
-                </mc:Choice>
-                <mc:Fallback xmlns:w16sdtfl="http://schemas.microsoft.com/office/word/2024/wordml/sdtformatlock" xmlns:w16sdtdh="http://schemas.microsoft.com/office/word/2020/wordml/sdtdatahash" xmlns:w16du="http://schemas.microsoft.com/office/word/2023/wordml/word16du" xmlns:w16="http://schemas.microsoft.com/office/word/2018/wordml" xmlns:w16cex="http://schemas.microsoft.com/office/word/2018/wordml/cex" xmlns:oel="http://schemas.microsoft.com/office/2019/extlst">
-                  <w:pict>
-                    <v:rect w14:anchorId="75E86521" id="Rectangle 27" o:spid="_x0000_s1027" style="position:absolute;left:0;text-align:left;margin-left:127.35pt;margin-top:.2pt;width:12.75pt;height:7.15pt;z-index:251660288;visibility:visible;mso-wrap-style:square;mso-width-percent:0;mso-height-percent:0;mso-wrap-distance-left:9pt;mso-wrap-distance-top:0;mso-wrap-distance-right:9pt;mso-wrap-distance-bottom:0;mso-position-horizontal:absolute;mso-position-horizontal-relative:text;mso-position-vertical:absolute;mso-position-vertical-relative:text;mso-width-percent:0;mso-height-percent:0;mso-width-relative:page;mso-height-relative:page;v-text-anchor:top" o:gfxdata="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">
-                      <v:textbox>
-                        <w:txbxContent>
-                          <w:p/>
-                        </w:txbxContent>
-                      </v:textbox>
-                    </v:rect>
-                  </w:pict>
-                </mc:Fallback>
-              </mc:AlternateContent>
-            </w:r>
-            <w:r>
-              <w:rPr>
-                <w:noProof/>
-                <w:sz w:val="24"/>
-                <w:szCs w:val="24"/>
-                <w:lang w:val="en-IN" w:eastAsia="en-IN"/>
-              </w:rPr>
-              <mc:AlternateContent>
-                <mc:Choice Requires="wps">
-                  <w:drawing>
-                    <wp:anchor distT="0" distB="0" distL="114300" distR="114300" simplePos="0" relativeHeight="251659264" behindDoc="0" locked="0" layoutInCell="1" allowOverlap="1" wp14:anchorId="6F7C99F9" wp14:editId="64072667">
-                      <wp:simplePos x="0" y="0"/>
-                      <wp:positionH relativeFrom="column">
-                        <wp:posOffset>398145</wp:posOffset>
-                      </wp:positionH>
-                      <wp:positionV relativeFrom="paragraph">
-                        <wp:posOffset>2540</wp:posOffset>
-                      </wp:positionV>
-                      <wp:extent cx="161925" cy="90805"/>
-                      <wp:effectExtent l="7620" t="12065" r="11430" b="11430"/>
-                      <wp:wrapNone/>
-                      <wp:docPr id="985395598" name="Rectangle 26"/>
-                      <wp:cNvGraphicFramePr>
-                        <a:graphicFrameLocks xmlns:a="http://schemas.openxmlformats.org/drawingml/2006/main"/>
-                      </wp:cNvGraphicFramePr>
-                      <a:graphic xmlns:a="http://schemas.openxmlformats.org/drawingml/2006/main">
-                        <a:graphicData uri="http://schemas.microsoft.com/office/word/2010/wordprocessingShape">
-                          <wps:wsp>
-                            <wps:cNvSpPr>
-                              <a:spLocks noChangeArrowheads="1"/>
-                            </wps:cNvSpPr>
-                            <wps:spPr bwMode="auto">
-                              <a:xfrm>
-                                <a:off x="0" y="0"/>
-                                <a:ext cx="161925" cy="90805"/>
-                              </a:xfrm>
-                              <a:prstGeom prst="rect">
-                                <a:avLst/>
-                              </a:prstGeom>
-                              <a:solidFill>
-                                <a:srgbClr val="FFFFFF"/>
-                              </a:solidFill>
-                              <a:ln w="9525">
-                                <a:solidFill>
-                                  <a:srgbClr val="000000"/>
-                                </a:solidFill>
-                                <a:miter lim="800000"/>
-                                <a:headEnd/>
-                                <a:tailEnd/>
-                              </a:ln>
-                            </wps:spPr>
-                            <wps:txbx>
-                              <w:txbxContent>
-                                <w:p/>
-                              </w:txbxContent>
-                            </wps:txbx>
-                            <wps:bodyPr rot="0" vert="horz" wrap="square" lIns="91440" tIns="45720" rIns="91440" bIns="45720" anchor="t" anchorCtr="0" upright="1">
-                              <a:noAutofit/>
-                            </wps:bodyPr>
-                          </wps:wsp>
-                        </a:graphicData>
-                      </a:graphic>
-                      <wp14:sizeRelH relativeFrom="page">
-                        <wp14:pctWidth>0</wp14:pctWidth>
-                      </wp14:sizeRelH>
-                      <wp14:sizeRelV relativeFrom="page">
-                        <wp14:pctHeight>0</wp14:pctHeight>
-                      </wp14:sizeRelV>
-                    </wp:anchor>
-                  </w:drawing>
-                </mc:Choice>
-                <mc:Fallback xmlns:w16sdtfl="http://schemas.microsoft.com/office/word/2024/wordml/sdtformatlock" xmlns:w16sdtdh="http://schemas.microsoft.com/office/word/2020/wordml/sdtdatahash" xmlns:w16du="http://schemas.microsoft.com/office/word/2023/wordml/word16du" xmlns:w16="http://schemas.microsoft.com/office/word/2018/wordml" xmlns:w16cex="http://schemas.microsoft.com/office/word/2018/wordml/cex" xmlns:oel="http://schemas.microsoft.com/office/2019/extlst">
-                  <w:pict>
-                    <v:rect w14:anchorId="6F7C99F9" id="Rectangle 26" o:spid="_x0000_s1028" style="position:absolute;left:0;text-align:left;margin-left:31.35pt;margin-top:.2pt;width:12.75pt;height:7.15pt;z-index:251659264;visibility:visible;mso-wrap-style:square;mso-width-percent:0;mso-height-percent:0;mso-wrap-distance-left:9pt;mso-wrap-distance-top:0;mso-wrap-distance-right:9pt;mso-wrap-distance-bottom:0;mso-position-horizontal:absolute;mso-position-horizontal-relative:text;mso-position-vertical:absolute;mso-position-vertical-relative:text;mso-width-percent:0;mso-height-percent:0;mso-width-relative:page;mso-height-relative:page;v-text-anchor:top" o:gfxdata="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">
-                      <v:textbox>
-                        <w:txbxContent>
-                          <w:p/>
-                        </w:txbxContent>
-                      </v:textbox>
-                    </v:rect>
-                  </w:pict>
-                </mc:Fallback>
-              </mc:AlternateContent>
-            </w:r>
-            <w:r>
-              <w:rPr>
-                <w:sz w:val="24"/>
-                <w:szCs w:val="24"/>
-              </w:rPr>
-              <w:t xml:space="preserve"> </w:t>
+              <w:ind w:left="0"/>
+              <w:rPr>
+                <w:sz w:val="24"/>
+                <w:szCs w:val="24"/>
+              </w:rPr>
+            </w:pPr>
+            <w:r>
+              <w:rPr>
+                <w:sz w:val="24"/>
+                <w:szCs w:val="24"/>
+              </w:rPr>
+              <w:t xml:space="preserve">{{ '☒' if (borrower_nature|lower) == 'company' else '☐' }} Company    {{ '☒' if (borrower_nature|lower) == 'llp' else '☐' }} LLP    {{ '☒' if (borrower_nature|lower) == 'society' else '☐' }} Society    {{ '☒' if (borrower_nature|lower) == 'huf' else '☐' }} HUF</w:t>
             </w:r>
           </w:p>
           <w:p>
             <w:pPr>
               <w:spacing w:after="0" w:line="240" w:lineRule="auto"/>
-              <w:rPr>
-                <w:sz w:val="24"/>
-                <w:szCs w:val="24"/>
-              </w:rPr>
-            </w:pPr>
-            <w:r>
-              <w:rPr>
-                <w:sz w:val="24"/>
-                <w:szCs w:val="24"/>
-              </w:rPr>
-              <w:t>Company       LLP        Society            HUF</w:t>
-            </w:r>
-          </w:p>
-          <w:p>
-            <w:pPr>
-              <w:spacing w:after="0" w:line="240" w:lineRule="auto"/>
-              <w:rPr>
-                <w:sz w:val="24"/>
-                <w:szCs w:val="24"/>
-              </w:rPr>
-            </w:pPr>
-            <w:r>
-              <w:rPr>
-                <w:noProof/>
-                <w:sz w:val="24"/>
-                <w:szCs w:val="24"/>
-                <w:lang w:val="en-IN" w:eastAsia="en-IN"/>
-              </w:rPr>
-              <mc:AlternateContent>
-                <mc:Choice Requires="wps">
-                  <w:drawing>
-                    <wp:anchor distT="0" distB="0" distL="114300" distR="114300" simplePos="0" relativeHeight="251665408" behindDoc="0" locked="0" layoutInCell="1" allowOverlap="1" wp14:anchorId="1A2BD062" wp14:editId="016A9C4E">
-                      <wp:simplePos x="0" y="0"/>
-                      <wp:positionH relativeFrom="column">
-                        <wp:posOffset>950595</wp:posOffset>
-                      </wp:positionH>
-                      <wp:positionV relativeFrom="paragraph">
-                        <wp:posOffset>2540</wp:posOffset>
-                      </wp:positionV>
-                      <wp:extent cx="161925" cy="90805"/>
-                      <wp:effectExtent l="7620" t="12065" r="11430" b="11430"/>
-                      <wp:wrapNone/>
-                      <wp:docPr id="242933828" name="Rectangle 25"/>
-                      <wp:cNvGraphicFramePr>
-                        <a:graphicFrameLocks xmlns:a="http://schemas.openxmlformats.org/drawingml/2006/main"/>
-                      </wp:cNvGraphicFramePr>
-                      <a:graphic xmlns:a="http://schemas.openxmlformats.org/drawingml/2006/main">
-                        <a:graphicData uri="http://schemas.microsoft.com/office/word/2010/wordprocessingShape">
-                          <wps:wsp>
-                            <wps:cNvSpPr>
-                              <a:spLocks noChangeArrowheads="1"/>
-                            </wps:cNvSpPr>
-                            <wps:spPr bwMode="auto">
-                              <a:xfrm>
-                                <a:off x="0" y="0"/>
-                                <a:ext cx="161925" cy="90805"/>
-                              </a:xfrm>
-                              <a:prstGeom prst="rect">
-                                <a:avLst/>
-                              </a:prstGeom>
-                              <a:solidFill>
-                                <a:srgbClr val="FFFFFF"/>
-                              </a:solidFill>
-                              <a:ln w="9525">
-                                <a:solidFill>
-                                  <a:srgbClr val="000000"/>
-                                </a:solidFill>
-                                <a:miter lim="800000"/>
-                                <a:headEnd/>
-                                <a:tailEnd/>
-                              </a:ln>
-                            </wps:spPr>
-                            <wps:txbx>
-                              <w:txbxContent>
-                                <w:p/>
-                              </w:txbxContent>
-                            </wps:txbx>
-                            <wps:bodyPr rot="0" vert="horz" wrap="square" lIns="91440" tIns="45720" rIns="91440" bIns="45720" anchor="t" anchorCtr="0" upright="1">
-                              <a:noAutofit/>
-                            </wps:bodyPr>
-                          </wps:wsp>
-                        </a:graphicData>
-                      </a:graphic>
-                      <wp14:sizeRelH relativeFrom="page">
-                        <wp14:pctWidth>0</wp14:pctWidth>
-                      </wp14:sizeRelH>
-                      <wp14:sizeRelV relativeFrom="page">
-                        <wp14:pctHeight>0</wp14:pctHeight>
-                      </wp14:sizeRelV>
-                    </wp:anchor>
-                  </w:drawing>
-                </mc:Choice>
-                <mc:Fallback xmlns:w16sdtfl="http://schemas.microsoft.com/office/word/2024/wordml/sdtformatlock" xmlns:w16sdtdh="http://schemas.microsoft.com/office/word/2020/wordml/sdtdatahash" xmlns:w16du="http://schemas.microsoft.com/office/word/2023/wordml/word16du" xmlns:w16="http://schemas.microsoft.com/office/word/2018/wordml" xmlns:w16cex="http://schemas.microsoft.com/office/word/2018/wordml/cex" xmlns:oel="http://schemas.microsoft.com/office/2019/extlst">
-                  <w:pict>
-                    <v:rect w14:anchorId="1A2BD062" id="Rectangle 25" o:spid="_x0000_s1029" style="position:absolute;left:0;text-align:left;margin-left:74.85pt;margin-top:.2pt;width:12.75pt;height:7.15pt;z-index:251665408;visibility:visible;mso-wrap-style:square;mso-width-percent:0;mso-height-percent:0;mso-wrap-distance-left:9pt;mso-wrap-distance-top:0;mso-wrap-distance-right:9pt;mso-wrap-distance-bottom:0;mso-position-horizontal:absolute;mso-position-horizontal-relative:text;mso-position-vertical:absolute;mso-position-vertical-relative:text;mso-width-percent:0;mso-height-percent:0;mso-width-relative:page;mso-height-relative:page;v-text-anchor:top" o:gfxdata="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">
-                      <v:textbox>
-                        <w:txbxContent>
-                          <w:p/>
-                        </w:txbxContent>
-                      </v:textbox>
-                    </v:rect>
-                  </w:pict>
-                </mc:Fallback>
-              </mc:AlternateContent>
-            </w:r>
-            <w:r>
-              <w:rPr>
-                <w:noProof/>
-                <w:sz w:val="24"/>
-                <w:szCs w:val="24"/>
-                <w:lang w:val="en-IN" w:eastAsia="en-IN"/>
-              </w:rPr>
-              <mc:AlternateContent>
-                <mc:Choice Requires="wps">
-                  <w:drawing>
-                    <wp:anchor distT="0" distB="0" distL="114300" distR="114300" simplePos="0" relativeHeight="251664384" behindDoc="0" locked="0" layoutInCell="1" allowOverlap="1" wp14:anchorId="1DE5FADF" wp14:editId="66392A7E">
-                      <wp:simplePos x="0" y="0"/>
-                      <wp:positionH relativeFrom="column">
-                        <wp:posOffset>2474595</wp:posOffset>
-                      </wp:positionH>
-                      <wp:positionV relativeFrom="paragraph">
-                        <wp:posOffset>2540</wp:posOffset>
-                      </wp:positionV>
-                      <wp:extent cx="161925" cy="90805"/>
-                      <wp:effectExtent l="7620" t="12065" r="11430" b="11430"/>
-                      <wp:wrapNone/>
-                      <wp:docPr id="179470550" name="Rectangle 24"/>
-                      <wp:cNvGraphicFramePr>
-                        <a:graphicFrameLocks xmlns:a="http://schemas.openxmlformats.org/drawingml/2006/main"/>
-                      </wp:cNvGraphicFramePr>
-                      <a:graphic xmlns:a="http://schemas.openxmlformats.org/drawingml/2006/main">
-                        <a:graphicData uri="http://schemas.microsoft.com/office/word/2010/wordprocessingShape">
-                          <wps:wsp>
-                            <wps:cNvSpPr>
-                              <a:spLocks noChangeArrowheads="1"/>
-                            </wps:cNvSpPr>
-                            <wps:spPr bwMode="auto">
-                              <a:xfrm>
-                                <a:off x="0" y="0"/>
-                                <a:ext cx="161925" cy="90805"/>
-                              </a:xfrm>
-                              <a:prstGeom prst="rect">
-                                <a:avLst/>
-                              </a:prstGeom>
-                              <a:solidFill>
-                                <a:srgbClr val="FFFFFF"/>
-                              </a:solidFill>
-                              <a:ln w="9525">
-                                <a:solidFill>
-                                  <a:srgbClr val="000000"/>
-                                </a:solidFill>
-                                <a:miter lim="800000"/>
-                                <a:headEnd/>
-                                <a:tailEnd/>
-                              </a:ln>
-                            </wps:spPr>
-                            <wps:txbx>
-                              <w:txbxContent>
-                                <w:p/>
-                              </w:txbxContent>
-                            </wps:txbx>
-                            <wps:bodyPr rot="0" vert="horz" wrap="square" lIns="91440" tIns="45720" rIns="91440" bIns="45720" anchor="t" anchorCtr="0" upright="1">
-                              <a:noAutofit/>
-                            </wps:bodyPr>
-                          </wps:wsp>
-                        </a:graphicData>
-                      </a:graphic>
-                      <wp14:sizeRelH relativeFrom="page">
-                        <wp14:pctWidth>0</wp14:pctWidth>
-                      </wp14:sizeRelH>
-                      <wp14:sizeRelV relativeFrom="page">
-                        <wp14:pctHeight>0</wp14:pctHeight>
-                      </wp14:sizeRelV>
-                    </wp:anchor>
-                  </w:drawing>
-                </mc:Choice>
-                <mc:Fallback xmlns:w16sdtfl="http://schemas.microsoft.com/office/word/2024/wordml/sdtformatlock" xmlns:w16sdtdh="http://schemas.microsoft.com/office/word/2020/wordml/sdtdatahash" xmlns:w16du="http://schemas.microsoft.com/office/word/2023/wordml/word16du" xmlns:w16="http://schemas.microsoft.com/office/word/2018/wordml" xmlns:w16cex="http://schemas.microsoft.com/office/word/2018/wordml/cex" xmlns:oel="http://schemas.microsoft.com/office/2019/extlst">
-                  <w:pict>
-                    <v:rect w14:anchorId="1DE5FADF" id="Rectangle 24" o:spid="_x0000_s1030" style="position:absolute;left:0;text-align:left;margin-left:194.85pt;margin-top:.2pt;width:12.75pt;height:7.15pt;z-index:251664384;visibility:visible;mso-wrap-style:square;mso-width-percent:0;mso-height-percent:0;mso-wrap-distance-left:9pt;mso-wrap-distance-top:0;mso-wrap-distance-right:9pt;mso-wrap-distance-bottom:0;mso-position-horizontal:absolute;mso-position-horizontal-relative:text;mso-position-vertical:absolute;mso-position-vertical-relative:text;mso-width-percent:0;mso-height-percent:0;mso-width-relative:page;mso-height-relative:page;v-text-anchor:top" o:gfxdata="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">
-                      <v:textbox>
-                        <w:txbxContent>
-                          <w:p/>
-                        </w:txbxContent>
-                      </v:textbox>
-                    </v:rect>
-                  </w:pict>
-                </mc:Fallback>
-              </mc:AlternateContent>
-            </w:r>
-            <w:r>
-              <w:rPr>
-                <w:noProof/>
-                <w:sz w:val="24"/>
-                <w:szCs w:val="24"/>
-                <w:lang w:val="en-IN" w:eastAsia="en-IN"/>
-              </w:rPr>
-              <mc:AlternateContent>
-                <mc:Choice Requires="wps">
-                  <w:drawing>
-                    <wp:anchor distT="0" distB="0" distL="114300" distR="114300" simplePos="0" relativeHeight="251662336" behindDoc="0" locked="0" layoutInCell="1" allowOverlap="1" wp14:anchorId="1AD60A7D" wp14:editId="126339A6">
-                      <wp:simplePos x="0" y="0"/>
-                      <wp:positionH relativeFrom="column">
-                        <wp:posOffset>1645920</wp:posOffset>
-                      </wp:positionH>
-                      <wp:positionV relativeFrom="paragraph">
-                        <wp:posOffset>2540</wp:posOffset>
-                      </wp:positionV>
-                      <wp:extent cx="161925" cy="90805"/>
-                      <wp:effectExtent l="7620" t="12065" r="11430" b="11430"/>
-                      <wp:wrapNone/>
-                      <wp:docPr id="1300330268" name="Rectangle 23"/>
-                      <wp:cNvGraphicFramePr>
-                        <a:graphicFrameLocks xmlns:a="http://schemas.openxmlformats.org/drawingml/2006/main"/>
-                      </wp:cNvGraphicFramePr>
-                      <a:graphic xmlns:a="http://schemas.openxmlformats.org/drawingml/2006/main">
-                        <a:graphicData uri="http://schemas.microsoft.com/office/word/2010/wordprocessingShape">
-                          <wps:wsp>
-                            <wps:cNvSpPr>
-                              <a:spLocks noChangeArrowheads="1"/>
-                            </wps:cNvSpPr>
-                            <wps:spPr bwMode="auto">
-                              <a:xfrm>
-                                <a:off x="0" y="0"/>
-                                <a:ext cx="161925" cy="90805"/>
-                              </a:xfrm>
-                              <a:prstGeom prst="rect">
-                                <a:avLst/>
-                              </a:prstGeom>
-                              <a:solidFill>
-                                <a:srgbClr val="FFFFFF"/>
-                              </a:solidFill>
-                              <a:ln w="9525">
-                                <a:solidFill>
-                                  <a:srgbClr val="000000"/>
-                                </a:solidFill>
-                                <a:miter lim="800000"/>
-                                <a:headEnd/>
-                                <a:tailEnd/>
-                              </a:ln>
-                            </wps:spPr>
-                            <wps:txbx>
-                              <w:txbxContent>
-                                <w:p/>
-                              </w:txbxContent>
-                            </wps:txbx>
-                            <wps:bodyPr rot="0" vert="horz" wrap="square" lIns="91440" tIns="45720" rIns="91440" bIns="45720" anchor="t" anchorCtr="0" upright="1">
-                              <a:noAutofit/>
-                            </wps:bodyPr>
-                          </wps:wsp>
-                        </a:graphicData>
-                      </a:graphic>
-                      <wp14:sizeRelH relativeFrom="page">
-                        <wp14:pctWidth>0</wp14:pctWidth>
-                      </wp14:sizeRelH>
-                      <wp14:sizeRelV relativeFrom="page">
-                        <wp14:pctHeight>0</wp14:pctHeight>
-                      </wp14:sizeRelV>
-                    </wp:anchor>
-                  </w:drawing>
-                </mc:Choice>
-                <mc:Fallback xmlns:w16sdtfl="http://schemas.microsoft.com/office/word/2024/wordml/sdtformatlock" xmlns:w16sdtdh="http://schemas.microsoft.com/office/word/2020/wordml/sdtdatahash" xmlns:w16du="http://schemas.microsoft.com/office/word/2023/wordml/word16du" xmlns:w16="http://schemas.microsoft.com/office/word/2018/wordml" xmlns:w16cex="http://schemas.microsoft.com/office/word/2018/wordml/cex" xmlns:oel="http://schemas.microsoft.com/office/2019/extlst">
-                  <w:pict>
-                    <v:rect w14:anchorId="1AD60A7D" id="Rectangle 23" o:spid="_x0000_s1031" style="position:absolute;left:0;text-align:left;margin-left:129.6pt;margin-top:.2pt;width:12.75pt;height:7.15pt;z-index:251662336;visibility:visible;mso-wrap-style:square;mso-width-percent:0;mso-height-percent:0;mso-wrap-distance-left:9pt;mso-wrap-distance-top:0;mso-wrap-distance-right:9pt;mso-wrap-distance-bottom:0;mso-position-horizontal:absolute;mso-position-horizontal-relative:text;mso-position-vertical:absolute;mso-position-vertical-relative:text;mso-width-percent:0;mso-height-percent:0;mso-width-relative:page;mso-height-relative:page;v-text-anchor:top" o:gfxdata="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">
-                      <v:textbox>
-                        <w:txbxContent>
-                          <w:p/>
-                        </w:txbxContent>
-                      </v:textbox>
-                    </v:rect>
-                  </w:pict>
-                </mc:Fallback>
-              </mc:AlternateContent>
-            </w:r>
-            <w:r>
-              <w:rPr>
-                <w:noProof/>
-                <w:sz w:val="24"/>
-                <w:szCs w:val="24"/>
-                <w:lang w:val="en-IN" w:eastAsia="en-IN"/>
-              </w:rPr>
-              <mc:AlternateContent>
-                <mc:Choice Requires="wps">
-                  <w:drawing>
-                    <wp:anchor distT="0" distB="0" distL="114300" distR="114300" simplePos="0" relativeHeight="251661312" behindDoc="0" locked="0" layoutInCell="1" allowOverlap="1" wp14:anchorId="205D3035" wp14:editId="6B7DBFE3">
-                      <wp:simplePos x="0" y="0"/>
-                      <wp:positionH relativeFrom="column">
-                        <wp:posOffset>274320</wp:posOffset>
-                      </wp:positionH>
-                      <wp:positionV relativeFrom="paragraph">
-                        <wp:posOffset>2540</wp:posOffset>
-                      </wp:positionV>
-                      <wp:extent cx="161925" cy="90805"/>
-                      <wp:effectExtent l="7620" t="12065" r="11430" b="11430"/>
-                      <wp:wrapNone/>
-                      <wp:docPr id="236371982" name="Rectangle 22"/>
-                      <wp:cNvGraphicFramePr>
-                        <a:graphicFrameLocks xmlns:a="http://schemas.openxmlformats.org/drawingml/2006/main"/>
-                      </wp:cNvGraphicFramePr>
-                      <a:graphic xmlns:a="http://schemas.openxmlformats.org/drawingml/2006/main">
-                        <a:graphicData uri="http://schemas.microsoft.com/office/word/2010/wordprocessingShape">
-                          <wps:wsp>
-                            <wps:cNvSpPr>
-                              <a:spLocks noChangeArrowheads="1"/>
-                            </wps:cNvSpPr>
-                            <wps:spPr bwMode="auto">
-                              <a:xfrm>
-                                <a:off x="0" y="0"/>
-                                <a:ext cx="161925" cy="90805"/>
-                              </a:xfrm>
-                              <a:prstGeom prst="rect">
-                                <a:avLst/>
-                              </a:prstGeom>
-                              <a:solidFill>
-                                <a:srgbClr val="FFFFFF"/>
-                              </a:solidFill>
-                              <a:ln w="9525">
-                                <a:solidFill>
-                                  <a:srgbClr val="000000"/>
-                                </a:solidFill>
-                                <a:miter lim="800000"/>
-                                <a:headEnd/>
-                                <a:tailEnd/>
-                              </a:ln>
-                            </wps:spPr>
-                            <wps:txbx>
-                              <w:txbxContent>
-                                <w:p/>
-                              </w:txbxContent>
-                            </wps:txbx>
-                            <wps:bodyPr rot="0" vert="horz" wrap="square" lIns="91440" tIns="45720" rIns="91440" bIns="45720" anchor="t" anchorCtr="0" upright="1">
-                              <a:noAutofit/>
-                            </wps:bodyPr>
-                          </wps:wsp>
-                        </a:graphicData>
-                      </a:graphic>
-                      <wp14:sizeRelH relativeFrom="page">
-                        <wp14:pctWidth>0</wp14:pctWidth>
-                      </wp14:sizeRelH>
-                      <wp14:sizeRelV relativeFrom="page">
-                        <wp14:pctHeight>0</wp14:pctHeight>
-                      </wp14:sizeRelV>
-                    </wp:anchor>
-                  </w:drawing>
-                </mc:Choice>
-                <mc:Fallback xmlns:w16sdtfl="http://schemas.microsoft.com/office/word/2024/wordml/sdtformatlock" xmlns:w16sdtdh="http://schemas.microsoft.com/office/word/2020/wordml/sdtdatahash" xmlns:w16du="http://schemas.microsoft.com/office/word/2023/wordml/word16du" xmlns:w16="http://schemas.microsoft.com/office/word/2018/wordml" xmlns:w16cex="http://schemas.microsoft.com/office/word/2018/wordml/cex" xmlns:oel="http://schemas.microsoft.com/office/2019/extlst">
-                  <w:pict>
-                    <v:rect w14:anchorId="205D3035" id="Rectangle 22" o:spid="_x0000_s1032" style="position:absolute;left:0;text-align:left;margin-left:21.6pt;margin-top:.2pt;width:12.75pt;height:7.15pt;z-index:251661312;visibility:visible;mso-wrap-style:square;mso-width-percent:0;mso-height-percent:0;mso-wrap-distance-left:9pt;mso-wrap-distance-top:0;mso-wrap-distance-right:9pt;mso-wrap-distance-bottom:0;mso-position-horizontal:absolute;mso-position-horizontal-relative:text;mso-position-vertical:absolute;mso-position-vertical-relative:text;mso-width-percent:0;mso-height-percent:0;mso-width-relative:page;mso-height-relative:page;v-text-anchor:top" o:gfxdata="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">
-                      <v:textbox>
-                        <w:txbxContent>
-                          <w:p/>
-                        </w:txbxContent>
-                      </v:textbox>
-                    </v:rect>
-                  </w:pict>
-                </mc:Fallback>
-              </mc:AlternateContent>
-            </w:r>
-            <w:r>
-              <w:rPr>
-                <w:sz w:val="24"/>
-                <w:szCs w:val="24"/>
-              </w:rPr>
-              <w:t xml:space="preserve"> </w:t>
-            </w:r>
-          </w:p>
-          <w:p>
-            <w:pPr>
-              <w:spacing w:after="0" w:line="240" w:lineRule="auto"/>
-              <w:rPr>
-                <w:sz w:val="24"/>
-                <w:szCs w:val="24"/>
-              </w:rPr>
-            </w:pPr>
-            <w:r>
-              <w:rPr>
-                <w:sz w:val="24"/>
-                <w:szCs w:val="24"/>
-              </w:rPr>
-              <w:t xml:space="preserve">Individual           </w:t>
-            </w:r>
-          </w:p>
-          <w:p>
-            <w:pPr>
-              <w:spacing w:after="0" w:line="240" w:lineRule="auto"/>
-              <w:rPr>
-                <w:sz w:val="24"/>
-                <w:szCs w:val="24"/>
-              </w:rPr>
-            </w:pPr>
-            <w:r>
-              <w:rPr>
-                <w:noProof/>
-                <w:sz w:val="24"/>
-                <w:szCs w:val="24"/>
-                <w:lang w:val="en-IN" w:eastAsia="en-IN"/>
-              </w:rPr>
-              <mc:AlternateContent>
-                <mc:Choice Requires="wps">
-                  <w:drawing>
-                    <wp:anchor distT="0" distB="0" distL="114300" distR="114300" simplePos="0" relativeHeight="251673600" behindDoc="0" locked="0" layoutInCell="1" allowOverlap="1" wp14:anchorId="320F3014" wp14:editId="70E5DD43">
-                      <wp:simplePos x="0" y="0"/>
-                      <wp:positionH relativeFrom="column">
-                        <wp:posOffset>274320</wp:posOffset>
-                      </wp:positionH>
-                      <wp:positionV relativeFrom="paragraph">
-                        <wp:posOffset>2540</wp:posOffset>
-                      </wp:positionV>
-                      <wp:extent cx="161925" cy="90805"/>
-                      <wp:effectExtent l="25400" t="24765" r="31750" b="46355"/>
-                      <wp:wrapNone/>
-                      <wp:docPr id="1462668486" name="Rectangle 21"/>
-                      <wp:cNvGraphicFramePr>
-                        <a:graphicFrameLocks xmlns:a="http://schemas.openxmlformats.org/drawingml/2006/main"/>
-                      </wp:cNvGraphicFramePr>
-                      <a:graphic xmlns:a="http://schemas.openxmlformats.org/drawingml/2006/main">
-                        <a:graphicData uri="http://schemas.microsoft.com/office/word/2010/wordprocessingShape">
-                          <wps:wsp>
-                            <wps:cNvSpPr>
-                              <a:spLocks noChangeArrowheads="1"/>
-                            </wps:cNvSpPr>
-                            <wps:spPr bwMode="auto">
-                              <a:xfrm>
-                                <a:off x="0" y="0"/>
-                                <a:ext cx="161925" cy="90805"/>
-                              </a:xfrm>
-                              <a:prstGeom prst="rect">
-                                <a:avLst/>
-                              </a:prstGeom>
-                              <a:solidFill>
-                                <a:srgbClr val="000000"/>
-                              </a:solidFill>
-                              <a:ln w="38100">
-                                <a:solidFill>
-                                  <a:srgbClr val="F2F2F2"/>
-                                </a:solidFill>
-                                <a:miter lim="800000"/>
-                                <a:headEnd/>
-                                <a:tailEnd/>
-                              </a:ln>
-                              <a:effectLst>
-                                <a:outerShdw dist="28398" dir="3806097" algn="ctr" rotWithShape="0">
-                                  <a:srgbClr val="7F7F7F">
-                                    <a:alpha val="50000"/>
-                                  </a:srgbClr>
-                                </a:outerShdw>
-                              </a:effectLst>
-                            </wps:spPr>
-                            <wps:txbx>
-                              <w:txbxContent>
-                                <w:p/>
-                              </w:txbxContent>
-                            </wps:txbx>
-                            <wps:bodyPr rot="0" vert="horz" wrap="square" lIns="91440" tIns="45720" rIns="91440" bIns="45720" anchor="t" anchorCtr="0" upright="1">
-                              <a:noAutofit/>
-                            </wps:bodyPr>
-                          </wps:wsp>
-                        </a:graphicData>
-                      </a:graphic>
-                      <wp14:sizeRelH relativeFrom="page">
-                        <wp14:pctWidth>0</wp14:pctWidth>
-                      </wp14:sizeRelH>
-                      <wp14:sizeRelV relativeFrom="page">
-                        <wp14:pctHeight>0</wp14:pctHeight>
-                      </wp14:sizeRelV>
-                    </wp:anchor>
-                  </w:drawing>
-                </mc:Choice>
-                <mc:Fallback xmlns:w16sdtfl="http://schemas.microsoft.com/office/word/2024/wordml/sdtformatlock" xmlns:w16sdtdh="http://schemas.microsoft.com/office/word/2020/wordml/sdtdatahash" xmlns:w16du="http://schemas.microsoft.com/office/word/2023/wordml/word16du" xmlns:w16="http://schemas.microsoft.com/office/word/2018/wordml" xmlns:w16cex="http://schemas.microsoft.com/office/word/2018/wordml/cex" xmlns:oel="http://schemas.microsoft.com/office/2019/extlst">
-                  <w:pict>
-                    <v:rect w14:anchorId="320F3014" id="Rectangle 21" o:spid="_x0000_s1033" style="position:absolute;left:0;text-align:left;margin-left:21.6pt;margin-top:.2pt;width:12.75pt;height:7.15pt;z-index:251673600;visibility:visible;mso-wrap-style:square;mso-width-percent:0;mso-height-percent:0;mso-wrap-distance-left:9pt;mso-wrap-distance-top:0;mso-wrap-distance-right:9pt;mso-wrap-distance-bottom:0;mso-position-horizontal:absolute;mso-position-horizontal-relative:text;mso-position-vertical:absolute;mso-position-vertical-relative:text;mso-width-percent:0;mso-height-percent:0;mso-width-relative:page;mso-height-relative:page;v-text-anchor:top" o:gfxdata="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" fillcolor="black" strokecolor="#f2f2f2" strokeweight="3pt">
-                      <v:shadow on="t" color="#7f7f7f" opacity=".5" offset="1pt"/>
-                      <v:textbox>
-                        <w:txbxContent>
-                          <w:p/>
-                        </w:txbxContent>
-                      </v:textbox>
-                    </v:rect>
-                  </w:pict>
-                </mc:Fallback>
-              </mc:AlternateContent>
-            </w:r>
-            <w:r>
-              <w:rPr>
-                <w:sz w:val="24"/>
-                <w:szCs w:val="24"/>
-              </w:rPr>
-              <w:t xml:space="preserve"> </w:t>
+              <w:ind w:left="0"/>
+              <w:rPr>
+                <w:sz w:val="24"/>
+                <w:szCs w:val="24"/>
+              </w:rPr>
+            </w:pPr>
+            <w:r>
+              <w:rPr>
+                <w:sz w:val="24"/>
+                <w:szCs w:val="24"/>
+              </w:rPr>
+              <w:t xml:space="preserve">{{ '☒' if (borrower_nature|lower) == 'individual' else '☐' }} Individual</w:t>
             </w:r>
           </w:p>
         </w:tc>
@@ -1771,754 +1045,41 @@
                 <w:sz w:val="24"/>
                 <w:szCs w:val="24"/>
               </w:rPr>
-              <w:t>Sole Proprietorship    Partnership       Trust</w:t>
+              <w:t xml:space="preserve">{{ '☒' if (mortgagor_nature|lower) == 'sole proprietorship' else '☐' }} Sole Proprietorship    {{ '☒' if (mortgagor_nature|lower) == 'partnership' else '☐' }} Partnership    {{ '☒' if (mortgagor_nature|lower) == 'trust' else '☐' }} Trust</w:t>
             </w:r>
           </w:p>
           <w:p>
             <w:pPr>
               <w:spacing w:after="0" w:line="240" w:lineRule="auto"/>
-              <w:rPr>
-                <w:sz w:val="24"/>
-                <w:szCs w:val="24"/>
-              </w:rPr>
-            </w:pPr>
-            <w:r>
-              <w:rPr>
-                <w:noProof/>
-                <w:sz w:val="24"/>
-                <w:szCs w:val="24"/>
-                <w:lang w:val="en-IN" w:eastAsia="en-IN"/>
-              </w:rPr>
-              <mc:AlternateContent>
-                <mc:Choice Requires="wps">
-                  <w:drawing>
-                    <wp:anchor distT="0" distB="0" distL="114300" distR="114300" simplePos="0" relativeHeight="251670528" behindDoc="0" locked="0" layoutInCell="1" allowOverlap="1" wp14:anchorId="0BB44C68" wp14:editId="3DDF3D8D">
-                      <wp:simplePos x="0" y="0"/>
-                      <wp:positionH relativeFrom="column">
-                        <wp:posOffset>2465070</wp:posOffset>
-                      </wp:positionH>
-                      <wp:positionV relativeFrom="paragraph">
-                        <wp:posOffset>2540</wp:posOffset>
-                      </wp:positionV>
-                      <wp:extent cx="161925" cy="90805"/>
-                      <wp:effectExtent l="6350" t="5715" r="12700" b="8255"/>
-                      <wp:wrapNone/>
-                      <wp:docPr id="960907191" name="Rectangle 20"/>
-                      <wp:cNvGraphicFramePr>
-                        <a:graphicFrameLocks xmlns:a="http://schemas.openxmlformats.org/drawingml/2006/main"/>
-                      </wp:cNvGraphicFramePr>
-                      <a:graphic xmlns:a="http://schemas.openxmlformats.org/drawingml/2006/main">
-                        <a:graphicData uri="http://schemas.microsoft.com/office/word/2010/wordprocessingShape">
-                          <wps:wsp>
-                            <wps:cNvSpPr>
-                              <a:spLocks noChangeArrowheads="1"/>
-                            </wps:cNvSpPr>
-                            <wps:spPr bwMode="auto">
-                              <a:xfrm>
-                                <a:off x="0" y="0"/>
-                                <a:ext cx="161925" cy="90805"/>
-                              </a:xfrm>
-                              <a:prstGeom prst="rect">
-                                <a:avLst/>
-                              </a:prstGeom>
-                              <a:solidFill>
-                                <a:srgbClr val="FFFFFF"/>
-                              </a:solidFill>
-                              <a:ln w="9525">
-                                <a:solidFill>
-                                  <a:srgbClr val="000000"/>
-                                </a:solidFill>
-                                <a:miter lim="800000"/>
-                                <a:headEnd/>
-                                <a:tailEnd/>
-                              </a:ln>
-                            </wps:spPr>
-                            <wps:txbx>
-                              <w:txbxContent>
-                                <w:p/>
-                              </w:txbxContent>
-                            </wps:txbx>
-                            <wps:bodyPr rot="0" vert="horz" wrap="square" lIns="91440" tIns="45720" rIns="91440" bIns="45720" anchor="t" anchorCtr="0" upright="1">
-                              <a:noAutofit/>
-                            </wps:bodyPr>
-                          </wps:wsp>
-                        </a:graphicData>
-                      </a:graphic>
-                      <wp14:sizeRelH relativeFrom="page">
-                        <wp14:pctWidth>0</wp14:pctWidth>
-                      </wp14:sizeRelH>
-                      <wp14:sizeRelV relativeFrom="page">
-                        <wp14:pctHeight>0</wp14:pctHeight>
-                      </wp14:sizeRelV>
-                    </wp:anchor>
-                  </w:drawing>
-                </mc:Choice>
-                <mc:Fallback xmlns:w16sdtfl="http://schemas.microsoft.com/office/word/2024/wordml/sdtformatlock" xmlns:w16sdtdh="http://schemas.microsoft.com/office/word/2020/wordml/sdtdatahash" xmlns:w16du="http://schemas.microsoft.com/office/word/2023/wordml/word16du" xmlns:w16="http://schemas.microsoft.com/office/word/2018/wordml" xmlns:w16cex="http://schemas.microsoft.com/office/word/2018/wordml/cex" xmlns:oel="http://schemas.microsoft.com/office/2019/extlst">
-                  <w:pict>
-                    <v:rect w14:anchorId="0BB44C68" id="Rectangle 20" o:spid="_x0000_s1034" style="position:absolute;left:0;text-align:left;margin-left:194.1pt;margin-top:.2pt;width:12.75pt;height:7.15pt;z-index:251670528;visibility:visible;mso-wrap-style:square;mso-width-percent:0;mso-height-percent:0;mso-wrap-distance-left:9pt;mso-wrap-distance-top:0;mso-wrap-distance-right:9pt;mso-wrap-distance-bottom:0;mso-position-horizontal:absolute;mso-position-horizontal-relative:text;mso-position-vertical:absolute;mso-position-vertical-relative:text;mso-width-percent:0;mso-height-percent:0;mso-width-relative:page;mso-height-relative:page;v-text-anchor:top" o:gfxdata="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">
-                      <v:textbox>
-                        <w:txbxContent>
-                          <w:p/>
-                        </w:txbxContent>
-                      </v:textbox>
-                    </v:rect>
-                  </w:pict>
-                </mc:Fallback>
-              </mc:AlternateContent>
-            </w:r>
-            <w:r>
-              <w:rPr>
-                <w:noProof/>
-                <w:sz w:val="24"/>
-                <w:szCs w:val="24"/>
-                <w:lang w:val="en-IN" w:eastAsia="en-IN"/>
-              </w:rPr>
-              <mc:AlternateContent>
-                <mc:Choice Requires="wps">
-                  <w:drawing>
-                    <wp:anchor distT="0" distB="0" distL="114300" distR="114300" simplePos="0" relativeHeight="251667456" behindDoc="0" locked="0" layoutInCell="1" allowOverlap="1" wp14:anchorId="1EE3DCCB" wp14:editId="58425305">
-                      <wp:simplePos x="0" y="0"/>
-                      <wp:positionH relativeFrom="column">
-                        <wp:posOffset>1617345</wp:posOffset>
-                      </wp:positionH>
-                      <wp:positionV relativeFrom="paragraph">
-                        <wp:posOffset>2540</wp:posOffset>
-                      </wp:positionV>
-                      <wp:extent cx="161925" cy="90805"/>
-                      <wp:effectExtent l="6350" t="5715" r="12700" b="8255"/>
-                      <wp:wrapNone/>
-                      <wp:docPr id="1623304644" name="Rectangle 19"/>
-                      <wp:cNvGraphicFramePr>
-                        <a:graphicFrameLocks xmlns:a="http://schemas.openxmlformats.org/drawingml/2006/main"/>
-                      </wp:cNvGraphicFramePr>
-                      <a:graphic xmlns:a="http://schemas.openxmlformats.org/drawingml/2006/main">
-                        <a:graphicData uri="http://schemas.microsoft.com/office/word/2010/wordprocessingShape">
-                          <wps:wsp>
-                            <wps:cNvSpPr>
-                              <a:spLocks noChangeArrowheads="1"/>
-                            </wps:cNvSpPr>
-                            <wps:spPr bwMode="auto">
-                              <a:xfrm>
-                                <a:off x="0" y="0"/>
-                                <a:ext cx="161925" cy="90805"/>
-                              </a:xfrm>
-                              <a:prstGeom prst="rect">
-                                <a:avLst/>
-                              </a:prstGeom>
-                              <a:solidFill>
-                                <a:srgbClr val="FFFFFF"/>
-                              </a:solidFill>
-                              <a:ln w="9525">
-                                <a:solidFill>
-                                  <a:srgbClr val="000000"/>
-                                </a:solidFill>
-                                <a:miter lim="800000"/>
-                                <a:headEnd/>
-                                <a:tailEnd/>
-                              </a:ln>
-                            </wps:spPr>
-                            <wps:txbx>
-                              <w:txbxContent>
-                                <w:p/>
-                              </w:txbxContent>
-                            </wps:txbx>
-                            <wps:bodyPr rot="0" vert="horz" wrap="square" lIns="91440" tIns="45720" rIns="91440" bIns="45720" anchor="t" anchorCtr="0" upright="1">
-                              <a:noAutofit/>
-                            </wps:bodyPr>
-                          </wps:wsp>
-                        </a:graphicData>
-                      </a:graphic>
-                      <wp14:sizeRelH relativeFrom="page">
-                        <wp14:pctWidth>0</wp14:pctWidth>
-                      </wp14:sizeRelH>
-                      <wp14:sizeRelV relativeFrom="page">
-                        <wp14:pctHeight>0</wp14:pctHeight>
-                      </wp14:sizeRelV>
-                    </wp:anchor>
-                  </w:drawing>
-                </mc:Choice>
-                <mc:Fallback xmlns:w16sdtfl="http://schemas.microsoft.com/office/word/2024/wordml/sdtformatlock" xmlns:w16sdtdh="http://schemas.microsoft.com/office/word/2020/wordml/sdtdatahash" xmlns:w16du="http://schemas.microsoft.com/office/word/2023/wordml/word16du" xmlns:w16="http://schemas.microsoft.com/office/word/2018/wordml" xmlns:w16cex="http://schemas.microsoft.com/office/word/2018/wordml/cex" xmlns:oel="http://schemas.microsoft.com/office/2019/extlst">
-                  <w:pict>
-                    <v:rect w14:anchorId="1EE3DCCB" id="Rectangle 19" o:spid="_x0000_s1035" style="position:absolute;left:0;text-align:left;margin-left:127.35pt;margin-top:.2pt;width:12.75pt;height:7.15pt;z-index:251667456;visibility:visible;mso-wrap-style:square;mso-width-percent:0;mso-height-percent:0;mso-wrap-distance-left:9pt;mso-wrap-distance-top:0;mso-wrap-distance-right:9pt;mso-wrap-distance-bottom:0;mso-position-horizontal:absolute;mso-position-horizontal-relative:text;mso-position-vertical:absolute;mso-position-vertical-relative:text;mso-width-percent:0;mso-height-percent:0;mso-width-relative:page;mso-height-relative:page;v-text-anchor:top" o:gfxdata="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">
-                      <v:textbox>
-                        <w:txbxContent>
-                          <w:p/>
-                        </w:txbxContent>
-                      </v:textbox>
-                    </v:rect>
-                  </w:pict>
-                </mc:Fallback>
-              </mc:AlternateContent>
-            </w:r>
-            <w:r>
-              <w:rPr>
-                <w:noProof/>
-                <w:sz w:val="24"/>
-                <w:szCs w:val="24"/>
-                <w:lang w:val="en-IN" w:eastAsia="en-IN"/>
-              </w:rPr>
-              <mc:AlternateContent>
-                <mc:Choice Requires="wps">
-                  <w:drawing>
-                    <wp:anchor distT="0" distB="0" distL="114300" distR="114300" simplePos="0" relativeHeight="251666432" behindDoc="0" locked="0" layoutInCell="1" allowOverlap="1" wp14:anchorId="269A1544" wp14:editId="43EA3F16">
-                      <wp:simplePos x="0" y="0"/>
-                      <wp:positionH relativeFrom="column">
-                        <wp:posOffset>398145</wp:posOffset>
-                      </wp:positionH>
-                      <wp:positionV relativeFrom="paragraph">
-                        <wp:posOffset>2540</wp:posOffset>
-                      </wp:positionV>
-                      <wp:extent cx="161925" cy="90805"/>
-                      <wp:effectExtent l="6350" t="5715" r="12700" b="8255"/>
-                      <wp:wrapNone/>
-                      <wp:docPr id="1480372344" name="Rectangle 18"/>
-                      <wp:cNvGraphicFramePr>
-                        <a:graphicFrameLocks xmlns:a="http://schemas.openxmlformats.org/drawingml/2006/main"/>
-                      </wp:cNvGraphicFramePr>
-                      <a:graphic xmlns:a="http://schemas.openxmlformats.org/drawingml/2006/main">
-                        <a:graphicData uri="http://schemas.microsoft.com/office/word/2010/wordprocessingShape">
-                          <wps:wsp>
-                            <wps:cNvSpPr>
-                              <a:spLocks noChangeArrowheads="1"/>
-                            </wps:cNvSpPr>
-                            <wps:spPr bwMode="auto">
-                              <a:xfrm>
-                                <a:off x="0" y="0"/>
-                                <a:ext cx="161925" cy="90805"/>
-                              </a:xfrm>
-                              <a:prstGeom prst="rect">
-                                <a:avLst/>
-                              </a:prstGeom>
-                              <a:solidFill>
-                                <a:srgbClr val="FFFFFF"/>
-                              </a:solidFill>
-                              <a:ln w="9525">
-                                <a:solidFill>
-                                  <a:srgbClr val="000000"/>
-                                </a:solidFill>
-                                <a:miter lim="800000"/>
-                                <a:headEnd/>
-                                <a:tailEnd/>
-                              </a:ln>
-                            </wps:spPr>
-                            <wps:txbx>
-                              <w:txbxContent>
-                                <w:p/>
-                              </w:txbxContent>
-                            </wps:txbx>
-                            <wps:bodyPr rot="0" vert="horz" wrap="square" lIns="91440" tIns="45720" rIns="91440" bIns="45720" anchor="t" anchorCtr="0" upright="1">
-                              <a:noAutofit/>
-                            </wps:bodyPr>
-                          </wps:wsp>
-                        </a:graphicData>
-                      </a:graphic>
-                      <wp14:sizeRelH relativeFrom="page">
-                        <wp14:pctWidth>0</wp14:pctWidth>
-                      </wp14:sizeRelH>
-                      <wp14:sizeRelV relativeFrom="page">
-                        <wp14:pctHeight>0</wp14:pctHeight>
-                      </wp14:sizeRelV>
-                    </wp:anchor>
-                  </w:drawing>
-                </mc:Choice>
-                <mc:Fallback xmlns:w16sdtfl="http://schemas.microsoft.com/office/word/2024/wordml/sdtformatlock" xmlns:w16sdtdh="http://schemas.microsoft.com/office/word/2020/wordml/sdtdatahash" xmlns:w16du="http://schemas.microsoft.com/office/word/2023/wordml/word16du" xmlns:w16="http://schemas.microsoft.com/office/word/2018/wordml" xmlns:w16cex="http://schemas.microsoft.com/office/word/2018/wordml/cex" xmlns:oel="http://schemas.microsoft.com/office/2019/extlst">
-                  <w:pict>
-                    <v:rect w14:anchorId="269A1544" id="Rectangle 18" o:spid="_x0000_s1036" style="position:absolute;left:0;text-align:left;margin-left:31.35pt;margin-top:.2pt;width:12.75pt;height:7.15pt;z-index:251666432;visibility:visible;mso-wrap-style:square;mso-width-percent:0;mso-height-percent:0;mso-wrap-distance-left:9pt;mso-wrap-distance-top:0;mso-wrap-distance-right:9pt;mso-wrap-distance-bottom:0;mso-position-horizontal:absolute;mso-position-horizontal-relative:text;mso-position-vertical:absolute;mso-position-vertical-relative:text;mso-width-percent:0;mso-height-percent:0;mso-width-relative:page;mso-height-relative:page;v-text-anchor:top" o:gfxdata="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">
-                      <v:textbox>
-                        <w:txbxContent>
-                          <w:p/>
-                        </w:txbxContent>
-                      </v:textbox>
-                    </v:rect>
-                  </w:pict>
-                </mc:Fallback>
-              </mc:AlternateContent>
-            </w:r>
-            <w:r>
-              <w:rPr>
-                <w:sz w:val="24"/>
-                <w:szCs w:val="24"/>
-              </w:rPr>
-              <w:t xml:space="preserve"> </w:t>
+              <w:ind w:left="0"/>
+              <w:rPr>
+                <w:sz w:val="24"/>
+                <w:szCs w:val="24"/>
+              </w:rPr>
+            </w:pPr>
+            <w:r>
+              <w:rPr>
+                <w:sz w:val="24"/>
+                <w:szCs w:val="24"/>
+              </w:rPr>
+              <w:t xml:space="preserve">{{ '☒' if (mortgagor_nature|lower) == 'individual' else '☐' }} Individual</w:t>
             </w:r>
           </w:p>
           <w:p>
             <w:pPr>
               <w:spacing w:after="0" w:line="240" w:lineRule="auto"/>
-              <w:rPr>
-                <w:sz w:val="24"/>
-                <w:szCs w:val="24"/>
-              </w:rPr>
-            </w:pPr>
-            <w:r>
-              <w:rPr>
-                <w:sz w:val="24"/>
-                <w:szCs w:val="24"/>
-              </w:rPr>
-              <w:t xml:space="preserve">Individual           </w:t>
-            </w:r>
-          </w:p>
-          <w:p>
-            <w:pPr>
-              <w:spacing w:after="0" w:line="240" w:lineRule="auto"/>
-              <w:rPr>
-                <w:sz w:val="24"/>
-                <w:szCs w:val="24"/>
-              </w:rPr>
-            </w:pPr>
-            <w:r>
-              <w:rPr>
-                <w:noProof/>
-                <w:sz w:val="24"/>
-                <w:szCs w:val="24"/>
-                <w:lang w:val="en-IN" w:eastAsia="en-IN"/>
-              </w:rPr>
-              <mc:AlternateContent>
-                <mc:Choice Requires="wps">
-                  <w:drawing>
-                    <wp:anchor distT="0" distB="0" distL="114300" distR="114300" simplePos="0" relativeHeight="251674624" behindDoc="0" locked="0" layoutInCell="1" allowOverlap="1" wp14:anchorId="002E8A0E" wp14:editId="0B591C36">
-                      <wp:simplePos x="0" y="0"/>
-                      <wp:positionH relativeFrom="column">
-                        <wp:posOffset>274320</wp:posOffset>
-                      </wp:positionH>
-                      <wp:positionV relativeFrom="paragraph">
-                        <wp:posOffset>2540</wp:posOffset>
-                      </wp:positionV>
-                      <wp:extent cx="161925" cy="90805"/>
-                      <wp:effectExtent l="25400" t="25400" r="31750" b="45720"/>
-                      <wp:wrapNone/>
-                      <wp:docPr id="571832729" name="Rectangle 17"/>
-                      <wp:cNvGraphicFramePr>
-                        <a:graphicFrameLocks xmlns:a="http://schemas.openxmlformats.org/drawingml/2006/main"/>
-                      </wp:cNvGraphicFramePr>
-                      <a:graphic xmlns:a="http://schemas.openxmlformats.org/drawingml/2006/main">
-                        <a:graphicData uri="http://schemas.microsoft.com/office/word/2010/wordprocessingShape">
-                          <wps:wsp>
-                            <wps:cNvSpPr>
-                              <a:spLocks noChangeArrowheads="1"/>
-                            </wps:cNvSpPr>
-                            <wps:spPr bwMode="auto">
-                              <a:xfrm>
-                                <a:off x="0" y="0"/>
-                                <a:ext cx="161925" cy="90805"/>
-                              </a:xfrm>
-                              <a:prstGeom prst="rect">
-                                <a:avLst/>
-                              </a:prstGeom>
-                              <a:solidFill>
-                                <a:srgbClr val="000000"/>
-                              </a:solidFill>
-                              <a:ln w="38100">
-                                <a:solidFill>
-                                  <a:srgbClr val="F2F2F2"/>
-                                </a:solidFill>
-                                <a:miter lim="800000"/>
-                                <a:headEnd/>
-                                <a:tailEnd/>
-                              </a:ln>
-                              <a:effectLst>
-                                <a:outerShdw dist="28398" dir="3806097" algn="ctr" rotWithShape="0">
-                                  <a:srgbClr val="7F7F7F">
-                                    <a:alpha val="50000"/>
-                                  </a:srgbClr>
-                                </a:outerShdw>
-                              </a:effectLst>
-                            </wps:spPr>
-                            <wps:txbx>
-                              <w:txbxContent>
-                                <w:p/>
-                              </w:txbxContent>
-                            </wps:txbx>
-                            <wps:bodyPr rot="0" vert="horz" wrap="square" lIns="91440" tIns="45720" rIns="91440" bIns="45720" anchor="t" anchorCtr="0" upright="1">
-                              <a:noAutofit/>
-                            </wps:bodyPr>
-                          </wps:wsp>
-                        </a:graphicData>
-                      </a:graphic>
-                      <wp14:sizeRelH relativeFrom="page">
-                        <wp14:pctWidth>0</wp14:pctWidth>
-                      </wp14:sizeRelH>
-                      <wp14:sizeRelV relativeFrom="page">
-                        <wp14:pctHeight>0</wp14:pctHeight>
-                      </wp14:sizeRelV>
-                    </wp:anchor>
-                  </w:drawing>
-                </mc:Choice>
-                <mc:Fallback xmlns:w16sdtfl="http://schemas.microsoft.com/office/word/2024/wordml/sdtformatlock" xmlns:w16sdtdh="http://schemas.microsoft.com/office/word/2020/wordml/sdtdatahash" xmlns:w16du="http://schemas.microsoft.com/office/word/2023/wordml/word16du" xmlns:w16="http://schemas.microsoft.com/office/word/2018/wordml" xmlns:w16cex="http://schemas.microsoft.com/office/word/2018/wordml/cex" xmlns:oel="http://schemas.microsoft.com/office/2019/extlst">
-                  <w:pict>
-                    <v:rect w14:anchorId="002E8A0E" id="Rectangle 17" o:spid="_x0000_s1037" style="position:absolute;left:0;text-align:left;margin-left:21.6pt;margin-top:.2pt;width:12.75pt;height:7.15pt;z-index:251674624;visibility:visible;mso-wrap-style:square;mso-width-percent:0;mso-height-percent:0;mso-wrap-distance-left:9pt;mso-wrap-distance-top:0;mso-wrap-distance-right:9pt;mso-wrap-distance-bottom:0;mso-position-horizontal:absolute;mso-position-horizontal-relative:text;mso-position-vertical:absolute;mso-position-vertical-relative:text;mso-width-percent:0;mso-height-percent:0;mso-width-relative:page;mso-height-relative:page;v-text-anchor:top" o:gfxdata="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" fillcolor="black" strokecolor="#f2f2f2" strokeweight="3pt">
-                      <v:shadow on="t" color="#7f7f7f" opacity=".5" offset="1pt"/>
-                      <v:textbox>
-                        <w:txbxContent>
-                          <w:p/>
-                        </w:txbxContent>
-                      </v:textbox>
-                    </v:rect>
-                  </w:pict>
-                </mc:Fallback>
-              </mc:AlternateContent>
-            </w:r>
-          </w:p>
-          <w:p>
-            <w:pPr>
-              <w:spacing w:after="0" w:line="240" w:lineRule="auto"/>
-              <w:rPr>
-                <w:sz w:val="24"/>
-                <w:szCs w:val="24"/>
-              </w:rPr>
-            </w:pPr>
-            <w:r>
-              <w:rPr>
-                <w:sz w:val="24"/>
-                <w:szCs w:val="24"/>
-              </w:rPr>
-              <w:t>Company       LLP        Society            HUF</w:t>
-            </w:r>
-          </w:p>
-          <w:p>
-            <w:pPr>
-              <w:spacing w:after="0" w:line="240" w:lineRule="auto"/>
-              <w:jc w:val="center"/>
-              <w:rPr>
-                <w:sz w:val="24"/>
-                <w:szCs w:val="24"/>
-              </w:rPr>
-            </w:pPr>
-            <w:r>
-              <w:rPr>
-                <w:noProof/>
-                <w:sz w:val="24"/>
-                <w:szCs w:val="24"/>
-                <w:lang w:val="en-IN" w:eastAsia="en-IN"/>
-              </w:rPr>
-              <mc:AlternateContent>
-                <mc:Choice Requires="wps">
-                  <w:drawing>
-                    <wp:anchor distT="0" distB="0" distL="114300" distR="114300" simplePos="0" relativeHeight="251672576" behindDoc="0" locked="0" layoutInCell="1" allowOverlap="1" wp14:anchorId="1472DEFB" wp14:editId="50B2128D">
-                      <wp:simplePos x="0" y="0"/>
-                      <wp:positionH relativeFrom="column">
-                        <wp:posOffset>950595</wp:posOffset>
-                      </wp:positionH>
-                      <wp:positionV relativeFrom="paragraph">
-                        <wp:posOffset>2540</wp:posOffset>
-                      </wp:positionV>
-                      <wp:extent cx="161925" cy="90805"/>
-                      <wp:effectExtent l="6350" t="6985" r="12700" b="6985"/>
-                      <wp:wrapNone/>
-                      <wp:docPr id="1256205286" name="Rectangle 16"/>
-                      <wp:cNvGraphicFramePr>
-                        <a:graphicFrameLocks xmlns:a="http://schemas.openxmlformats.org/drawingml/2006/main"/>
-                      </wp:cNvGraphicFramePr>
-                      <a:graphic xmlns:a="http://schemas.openxmlformats.org/drawingml/2006/main">
-                        <a:graphicData uri="http://schemas.microsoft.com/office/word/2010/wordprocessingShape">
-                          <wps:wsp>
-                            <wps:cNvSpPr>
-                              <a:spLocks noChangeArrowheads="1"/>
-                            </wps:cNvSpPr>
-                            <wps:spPr bwMode="auto">
-                              <a:xfrm>
-                                <a:off x="0" y="0"/>
-                                <a:ext cx="161925" cy="90805"/>
-                              </a:xfrm>
-                              <a:prstGeom prst="rect">
-                                <a:avLst/>
-                              </a:prstGeom>
-                              <a:solidFill>
-                                <a:srgbClr val="FFFFFF"/>
-                              </a:solidFill>
-                              <a:ln w="9525">
-                                <a:solidFill>
-                                  <a:srgbClr val="000000"/>
-                                </a:solidFill>
-                                <a:miter lim="800000"/>
-                                <a:headEnd/>
-                                <a:tailEnd/>
-                              </a:ln>
-                            </wps:spPr>
-                            <wps:txbx>
-                              <w:txbxContent>
-                                <w:p/>
-                              </w:txbxContent>
-                            </wps:txbx>
-                            <wps:bodyPr rot="0" vert="horz" wrap="square" lIns="91440" tIns="45720" rIns="91440" bIns="45720" anchor="t" anchorCtr="0" upright="1">
-                              <a:noAutofit/>
-                            </wps:bodyPr>
-                          </wps:wsp>
-                        </a:graphicData>
-                      </a:graphic>
-                      <wp14:sizeRelH relativeFrom="page">
-                        <wp14:pctWidth>0</wp14:pctWidth>
-                      </wp14:sizeRelH>
-                      <wp14:sizeRelV relativeFrom="page">
-                        <wp14:pctHeight>0</wp14:pctHeight>
-                      </wp14:sizeRelV>
-                    </wp:anchor>
-                  </w:drawing>
-                </mc:Choice>
-                <mc:Fallback xmlns:w16sdtfl="http://schemas.microsoft.com/office/word/2024/wordml/sdtformatlock" xmlns:w16sdtdh="http://schemas.microsoft.com/office/word/2020/wordml/sdtdatahash" xmlns:w16du="http://schemas.microsoft.com/office/word/2023/wordml/word16du" xmlns:w16="http://schemas.microsoft.com/office/word/2018/wordml" xmlns:w16cex="http://schemas.microsoft.com/office/word/2018/wordml/cex" xmlns:oel="http://schemas.microsoft.com/office/2019/extlst">
-                  <w:pict>
-                    <v:rect w14:anchorId="1472DEFB" id="Rectangle 16" o:spid="_x0000_s1038" style="position:absolute;left:0;text-align:left;margin-left:74.85pt;margin-top:.2pt;width:12.75pt;height:7.15pt;z-index:251672576;visibility:visible;mso-wrap-style:square;mso-width-percent:0;mso-height-percent:0;mso-wrap-distance-left:9pt;mso-wrap-distance-top:0;mso-wrap-distance-right:9pt;mso-wrap-distance-bottom:0;mso-position-horizontal:absolute;mso-position-horizontal-relative:text;mso-position-vertical:absolute;mso-position-vertical-relative:text;mso-width-percent:0;mso-height-percent:0;mso-width-relative:page;mso-height-relative:page;v-text-anchor:top" o:gfxdata="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">
-                      <v:textbox>
-                        <w:txbxContent>
-                          <w:p/>
-                        </w:txbxContent>
-                      </v:textbox>
-                    </v:rect>
-                  </w:pict>
-                </mc:Fallback>
-              </mc:AlternateContent>
-            </w:r>
-            <w:r>
-              <w:rPr>
-                <w:noProof/>
-                <w:sz w:val="24"/>
-                <w:szCs w:val="24"/>
-                <w:lang w:val="en-IN" w:eastAsia="en-IN"/>
-              </w:rPr>
-              <mc:AlternateContent>
-                <mc:Choice Requires="wps">
-                  <w:drawing>
-                    <wp:anchor distT="0" distB="0" distL="114300" distR="114300" simplePos="0" relativeHeight="251671552" behindDoc="0" locked="0" layoutInCell="1" allowOverlap="1" wp14:anchorId="15E0F6E3" wp14:editId="01B86D84">
-                      <wp:simplePos x="0" y="0"/>
-                      <wp:positionH relativeFrom="column">
-                        <wp:posOffset>2474595</wp:posOffset>
-                      </wp:positionH>
-                      <wp:positionV relativeFrom="paragraph">
-                        <wp:posOffset>2540</wp:posOffset>
-                      </wp:positionV>
-                      <wp:extent cx="161925" cy="90805"/>
-                      <wp:effectExtent l="6350" t="6985" r="12700" b="6985"/>
-                      <wp:wrapNone/>
-                      <wp:docPr id="290399839" name="Rectangle 15"/>
-                      <wp:cNvGraphicFramePr>
-                        <a:graphicFrameLocks xmlns:a="http://schemas.openxmlformats.org/drawingml/2006/main"/>
-                      </wp:cNvGraphicFramePr>
-                      <a:graphic xmlns:a="http://schemas.openxmlformats.org/drawingml/2006/main">
-                        <a:graphicData uri="http://schemas.microsoft.com/office/word/2010/wordprocessingShape">
-                          <wps:wsp>
-                            <wps:cNvSpPr>
-                              <a:spLocks noChangeArrowheads="1"/>
-                            </wps:cNvSpPr>
-                            <wps:spPr bwMode="auto">
-                              <a:xfrm>
-                                <a:off x="0" y="0"/>
-                                <a:ext cx="161925" cy="90805"/>
-                              </a:xfrm>
-                              <a:prstGeom prst="rect">
-                                <a:avLst/>
-                              </a:prstGeom>
-                              <a:solidFill>
-                                <a:srgbClr val="FFFFFF"/>
-                              </a:solidFill>
-                              <a:ln w="9525">
-                                <a:solidFill>
-                                  <a:srgbClr val="000000"/>
-                                </a:solidFill>
-                                <a:miter lim="800000"/>
-                                <a:headEnd/>
-                                <a:tailEnd/>
-                              </a:ln>
-                            </wps:spPr>
-                            <wps:txbx>
-                              <w:txbxContent>
-                                <w:p/>
-                              </w:txbxContent>
-                            </wps:txbx>
-                            <wps:bodyPr rot="0" vert="horz" wrap="square" lIns="91440" tIns="45720" rIns="91440" bIns="45720" anchor="t" anchorCtr="0" upright="1">
-                              <a:noAutofit/>
-                            </wps:bodyPr>
-                          </wps:wsp>
-                        </a:graphicData>
-                      </a:graphic>
-                      <wp14:sizeRelH relativeFrom="page">
-                        <wp14:pctWidth>0</wp14:pctWidth>
-                      </wp14:sizeRelH>
-                      <wp14:sizeRelV relativeFrom="page">
-                        <wp14:pctHeight>0</wp14:pctHeight>
-                      </wp14:sizeRelV>
-                    </wp:anchor>
-                  </w:drawing>
-                </mc:Choice>
-                <mc:Fallback xmlns:w16sdtfl="http://schemas.microsoft.com/office/word/2024/wordml/sdtformatlock" xmlns:w16sdtdh="http://schemas.microsoft.com/office/word/2020/wordml/sdtdatahash" xmlns:w16du="http://schemas.microsoft.com/office/word/2023/wordml/word16du" xmlns:w16="http://schemas.microsoft.com/office/word/2018/wordml" xmlns:w16cex="http://schemas.microsoft.com/office/word/2018/wordml/cex" xmlns:oel="http://schemas.microsoft.com/office/2019/extlst">
-                  <w:pict>
-                    <v:rect w14:anchorId="15E0F6E3" id="Rectangle 15" o:spid="_x0000_s1039" style="position:absolute;left:0;text-align:left;margin-left:194.85pt;margin-top:.2pt;width:12.75pt;height:7.15pt;z-index:251671552;visibility:visible;mso-wrap-style:square;mso-width-percent:0;mso-height-percent:0;mso-wrap-distance-left:9pt;mso-wrap-distance-top:0;mso-wrap-distance-right:9pt;mso-wrap-distance-bottom:0;mso-position-horizontal:absolute;mso-position-horizontal-relative:text;mso-position-vertical:absolute;mso-position-vertical-relative:text;mso-width-percent:0;mso-height-percent:0;mso-width-relative:page;mso-height-relative:page;v-text-anchor:top" o:gfxdata="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">
-                      <v:textbox>
-                        <w:txbxContent>
-                          <w:p/>
-                        </w:txbxContent>
-                      </v:textbox>
-                    </v:rect>
-                  </w:pict>
-                </mc:Fallback>
-              </mc:AlternateContent>
-            </w:r>
-            <w:r>
-              <w:rPr>
-                <w:noProof/>
-                <w:sz w:val="24"/>
-                <w:szCs w:val="24"/>
-                <w:lang w:val="en-IN" w:eastAsia="en-IN"/>
-              </w:rPr>
-              <mc:AlternateContent>
-                <mc:Choice Requires="wps">
-                  <w:drawing>
-                    <wp:anchor distT="0" distB="0" distL="114300" distR="114300" simplePos="0" relativeHeight="251669504" behindDoc="0" locked="0" layoutInCell="1" allowOverlap="1" wp14:anchorId="726C310B" wp14:editId="209C7C3C">
-                      <wp:simplePos x="0" y="0"/>
-                      <wp:positionH relativeFrom="column">
-                        <wp:posOffset>1645920</wp:posOffset>
-                      </wp:positionH>
-                      <wp:positionV relativeFrom="paragraph">
-                        <wp:posOffset>2540</wp:posOffset>
-                      </wp:positionV>
-                      <wp:extent cx="161925" cy="90805"/>
-                      <wp:effectExtent l="6350" t="6985" r="12700" b="6985"/>
-                      <wp:wrapNone/>
-                      <wp:docPr id="42656764" name="Rectangle 14"/>
-                      <wp:cNvGraphicFramePr>
-                        <a:graphicFrameLocks xmlns:a="http://schemas.openxmlformats.org/drawingml/2006/main"/>
-                      </wp:cNvGraphicFramePr>
-                      <a:graphic xmlns:a="http://schemas.openxmlformats.org/drawingml/2006/main">
-                        <a:graphicData uri="http://schemas.microsoft.com/office/word/2010/wordprocessingShape">
-                          <wps:wsp>
-                            <wps:cNvSpPr>
-                              <a:spLocks noChangeArrowheads="1"/>
-                            </wps:cNvSpPr>
-                            <wps:spPr bwMode="auto">
-                              <a:xfrm>
-                                <a:off x="0" y="0"/>
-                                <a:ext cx="161925" cy="90805"/>
-                              </a:xfrm>
-                              <a:prstGeom prst="rect">
-                                <a:avLst/>
-                              </a:prstGeom>
-                              <a:solidFill>
-                                <a:srgbClr val="FFFFFF"/>
-                              </a:solidFill>
-                              <a:ln w="9525">
-                                <a:solidFill>
-                                  <a:srgbClr val="000000"/>
-                                </a:solidFill>
-                                <a:miter lim="800000"/>
-                                <a:headEnd/>
-                                <a:tailEnd/>
-                              </a:ln>
-                            </wps:spPr>
-                            <wps:txbx>
-                              <w:txbxContent>
-                                <w:p/>
-                              </w:txbxContent>
-                            </wps:txbx>
-                            <wps:bodyPr rot="0" vert="horz" wrap="square" lIns="91440" tIns="45720" rIns="91440" bIns="45720" anchor="t" anchorCtr="0" upright="1">
-                              <a:noAutofit/>
-                            </wps:bodyPr>
-                          </wps:wsp>
-                        </a:graphicData>
-                      </a:graphic>
-                      <wp14:sizeRelH relativeFrom="page">
-                        <wp14:pctWidth>0</wp14:pctWidth>
-                      </wp14:sizeRelH>
-                      <wp14:sizeRelV relativeFrom="page">
-                        <wp14:pctHeight>0</wp14:pctHeight>
-                      </wp14:sizeRelV>
-                    </wp:anchor>
-                  </w:drawing>
-                </mc:Choice>
-                <mc:Fallback xmlns:w16sdtfl="http://schemas.microsoft.com/office/word/2024/wordml/sdtformatlock" xmlns:w16sdtdh="http://schemas.microsoft.com/office/word/2020/wordml/sdtdatahash" xmlns:w16du="http://schemas.microsoft.com/office/word/2023/wordml/word16du" xmlns:w16="http://schemas.microsoft.com/office/word/2018/wordml" xmlns:w16cex="http://schemas.microsoft.com/office/word/2018/wordml/cex" xmlns:oel="http://schemas.microsoft.com/office/2019/extlst">
-                  <w:pict>
-                    <v:rect w14:anchorId="726C310B" id="Rectangle 14" o:spid="_x0000_s1040" style="position:absolute;left:0;text-align:left;margin-left:129.6pt;margin-top:.2pt;width:12.75pt;height:7.15pt;z-index:251669504;visibility:visible;mso-wrap-style:square;mso-width-percent:0;mso-height-percent:0;mso-wrap-distance-left:9pt;mso-wrap-distance-top:0;mso-wrap-distance-right:9pt;mso-wrap-distance-bottom:0;mso-position-horizontal:absolute;mso-position-horizontal-relative:text;mso-position-vertical:absolute;mso-position-vertical-relative:text;mso-width-percent:0;mso-height-percent:0;mso-width-relative:page;mso-height-relative:page;v-text-anchor:top" o:gfxdata="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">
-                      <v:textbox>
-                        <w:txbxContent>
-                          <w:p/>
-                        </w:txbxContent>
-                      </v:textbox>
-                    </v:rect>
-                  </w:pict>
-                </mc:Fallback>
-              </mc:AlternateContent>
-            </w:r>
-            <w:r>
-              <w:rPr>
-                <w:noProof/>
-                <w:sz w:val="24"/>
-                <w:szCs w:val="24"/>
-                <w:lang w:val="en-IN" w:eastAsia="en-IN"/>
-              </w:rPr>
-              <mc:AlternateContent>
-                <mc:Choice Requires="wps">
-                  <w:drawing>
-                    <wp:anchor distT="0" distB="0" distL="114300" distR="114300" simplePos="0" relativeHeight="251668480" behindDoc="0" locked="0" layoutInCell="1" allowOverlap="1" wp14:anchorId="3BA26971" wp14:editId="5F65B3A4">
-                      <wp:simplePos x="0" y="0"/>
-                      <wp:positionH relativeFrom="column">
-                        <wp:posOffset>274320</wp:posOffset>
-                      </wp:positionH>
-                      <wp:positionV relativeFrom="paragraph">
-                        <wp:posOffset>2540</wp:posOffset>
-                      </wp:positionV>
-                      <wp:extent cx="161925" cy="90805"/>
-                      <wp:effectExtent l="6350" t="6985" r="12700" b="6985"/>
-                      <wp:wrapNone/>
-                      <wp:docPr id="1815859172" name="Rectangle 13"/>
-                      <wp:cNvGraphicFramePr>
-                        <a:graphicFrameLocks xmlns:a="http://schemas.openxmlformats.org/drawingml/2006/main"/>
-                      </wp:cNvGraphicFramePr>
-                      <a:graphic xmlns:a="http://schemas.openxmlformats.org/drawingml/2006/main">
-                        <a:graphicData uri="http://schemas.microsoft.com/office/word/2010/wordprocessingShape">
-                          <wps:wsp>
-                            <wps:cNvSpPr>
-                              <a:spLocks noChangeArrowheads="1"/>
-                            </wps:cNvSpPr>
-                            <wps:spPr bwMode="auto">
-                              <a:xfrm>
-                                <a:off x="0" y="0"/>
-                                <a:ext cx="161925" cy="90805"/>
-                              </a:xfrm>
-                              <a:prstGeom prst="rect">
-                                <a:avLst/>
-                              </a:prstGeom>
-                              <a:solidFill>
-                                <a:srgbClr val="FFFFFF"/>
-                              </a:solidFill>
-                              <a:ln w="9525">
-                                <a:solidFill>
-                                  <a:srgbClr val="000000"/>
-                                </a:solidFill>
-                                <a:miter lim="800000"/>
-                                <a:headEnd/>
-                                <a:tailEnd/>
-                              </a:ln>
-                            </wps:spPr>
-                            <wps:txbx>
-                              <w:txbxContent>
-                                <w:p/>
-                              </w:txbxContent>
-                            </wps:txbx>
-                            <wps:bodyPr rot="0" vert="horz" wrap="square" lIns="91440" tIns="45720" rIns="91440" bIns="45720" anchor="t" anchorCtr="0" upright="1">
-                              <a:noAutofit/>
-                            </wps:bodyPr>
-                          </wps:wsp>
-                        </a:graphicData>
-                      </a:graphic>
-                      <wp14:sizeRelH relativeFrom="page">
-                        <wp14:pctWidth>0</wp14:pctWidth>
-                      </wp14:sizeRelH>
-                      <wp14:sizeRelV relativeFrom="page">
-                        <wp14:pctHeight>0</wp14:pctHeight>
-                      </wp14:sizeRelV>
-                    </wp:anchor>
-                  </w:drawing>
-                </mc:Choice>
-                <mc:Fallback xmlns:w16sdtfl="http://schemas.microsoft.com/office/word/2024/wordml/sdtformatlock" xmlns:w16sdtdh="http://schemas.microsoft.com/office/word/2020/wordml/sdtdatahash" xmlns:w16du="http://schemas.microsoft.com/office/word/2023/wordml/word16du" xmlns:w16="http://schemas.microsoft.com/office/word/2018/wordml" xmlns:w16cex="http://schemas.microsoft.com/office/word/2018/wordml/cex" xmlns:oel="http://schemas.microsoft.com/office/2019/extlst">
-                  <w:pict>
-                    <v:rect w14:anchorId="3BA26971" id="Rectangle 13" o:spid="_x0000_s1041" style="position:absolute;left:0;text-align:left;margin-left:21.6pt;margin-top:.2pt;width:12.75pt;height:7.15pt;z-index:251668480;visibility:visible;mso-wrap-style:square;mso-width-percent:0;mso-height-percent:0;mso-wrap-distance-left:9pt;mso-wrap-distance-top:0;mso-wrap-distance-right:9pt;mso-wrap-distance-bottom:0;mso-position-horizontal:absolute;mso-position-horizontal-relative:text;mso-position-vertical:absolute;mso-position-vertical-relative:text;mso-width-percent:0;mso-height-percent:0;mso-width-relative:page;mso-height-relative:page;v-text-anchor:top" o:gfxdata="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">
-                      <v:textbox>
-                        <w:txbxContent>
-                          <w:p/>
-                        </w:txbxContent>
-                      </v:textbox>
-                    </v:rect>
-                  </w:pict>
-                </mc:Fallback>
-              </mc:AlternateContent>
+              <w:ind w:left="0"/>
+              <w:rPr>
+                <w:sz w:val="24"/>
+                <w:szCs w:val="24"/>
+              </w:rPr>
+            </w:pPr>
+            <w:r>
+              <w:rPr>
+                <w:sz w:val="24"/>
+                <w:szCs w:val="24"/>
+              </w:rPr>
+              <w:t xml:space="preserve">{{ '☒' if (mortgagor_nature|lower) == 'company' else '☐' }} Company    {{ '☒' if (mortgagor_nature|lower) == 'llp' else '☐' }} LLP    {{ '☒' if (mortgagor_nature|lower) == 'society' else '☐' }} Society    {{ '☒' if (mortgagor_nature|lower) == 'huf' else '☐' }} HUF</w:t>
             </w:r>
           </w:p>
         </w:tc>
@@ -3359,408 +1920,24 @@
                 <w:sz w:val="24"/>
                 <w:szCs w:val="24"/>
               </w:rPr>
-              <w:t>Commercial     Agriculture          Residential</w:t>
+              <w:t xml:space="preserve">{{ '☒' if (land_revenue_type|lower) == 'commercial' else '☐' }} Commercial    {{ '☒' if (land_revenue_type|lower) == 'agriculture' else '☐' }} Agriculture    {{ '☒' if (land_revenue_type|lower) == 'residential' else '☐' }} Residential</w:t>
             </w:r>
           </w:p>
           <w:p>
             <w:pPr>
               <w:spacing w:after="0" w:line="240" w:lineRule="auto"/>
-              <w:rPr>
-                <w:sz w:val="24"/>
-                <w:szCs w:val="24"/>
-              </w:rPr>
-            </w:pPr>
-            <w:r>
-              <w:rPr>
-                <w:noProof/>
-                <w:sz w:val="24"/>
-                <w:szCs w:val="24"/>
-                <w:lang w:val="en-IN" w:eastAsia="en-IN"/>
-              </w:rPr>
-              <mc:AlternateContent>
-                <mc:Choice Requires="wps">
-                  <w:drawing>
-                    <wp:anchor distT="0" distB="0" distL="114300" distR="114300" simplePos="0" relativeHeight="251681792" behindDoc="0" locked="0" layoutInCell="1" allowOverlap="1" wp14:anchorId="60B3D610" wp14:editId="6ED77306">
-                      <wp:simplePos x="0" y="0"/>
-                      <wp:positionH relativeFrom="column">
-                        <wp:posOffset>255905</wp:posOffset>
-                      </wp:positionH>
-                      <wp:positionV relativeFrom="paragraph">
-                        <wp:posOffset>106045</wp:posOffset>
-                      </wp:positionV>
-                      <wp:extent cx="161925" cy="90805"/>
-                      <wp:effectExtent l="9525" t="10795" r="9525" b="12700"/>
-                      <wp:wrapNone/>
-                      <wp:docPr id="566777478" name="Rectangle 12"/>
-                      <wp:cNvGraphicFramePr>
-                        <a:graphicFrameLocks xmlns:a="http://schemas.openxmlformats.org/drawingml/2006/main"/>
-                      </wp:cNvGraphicFramePr>
-                      <a:graphic xmlns:a="http://schemas.openxmlformats.org/drawingml/2006/main">
-                        <a:graphicData uri="http://schemas.microsoft.com/office/word/2010/wordprocessingShape">
-                          <wps:wsp>
-                            <wps:cNvSpPr>
-                              <a:spLocks noChangeArrowheads="1"/>
-                            </wps:cNvSpPr>
-                            <wps:spPr bwMode="auto">
-                              <a:xfrm>
-                                <a:off x="0" y="0"/>
-                                <a:ext cx="161925" cy="90805"/>
-                              </a:xfrm>
-                              <a:prstGeom prst="rect">
-                                <a:avLst/>
-                              </a:prstGeom>
-                              <a:solidFill>
-                                <a:srgbClr val="FFFFFF"/>
-                              </a:solidFill>
-                              <a:ln w="9525">
-                                <a:solidFill>
-                                  <a:srgbClr val="000000"/>
-                                </a:solidFill>
-                                <a:miter lim="800000"/>
-                                <a:headEnd/>
-                                <a:tailEnd/>
-                              </a:ln>
-                            </wps:spPr>
-                            <wps:txbx>
-                              <w:txbxContent>
-                                <w:p/>
-                              </w:txbxContent>
-                            </wps:txbx>
-                            <wps:bodyPr rot="0" vert="horz" wrap="square" lIns="91440" tIns="45720" rIns="91440" bIns="45720" anchor="t" anchorCtr="0" upright="1">
-                              <a:noAutofit/>
-                            </wps:bodyPr>
-                          </wps:wsp>
-                        </a:graphicData>
-                      </a:graphic>
-                      <wp14:sizeRelH relativeFrom="page">
-                        <wp14:pctWidth>0</wp14:pctWidth>
-                      </wp14:sizeRelH>
-                      <wp14:sizeRelV relativeFrom="page">
-                        <wp14:pctHeight>0</wp14:pctHeight>
-                      </wp14:sizeRelV>
-                    </wp:anchor>
-                  </w:drawing>
-                </mc:Choice>
-                <mc:Fallback xmlns:w16sdtfl="http://schemas.microsoft.com/office/word/2024/wordml/sdtformatlock" xmlns:w16sdtdh="http://schemas.microsoft.com/office/word/2020/wordml/sdtdatahash" xmlns:w16du="http://schemas.microsoft.com/office/word/2023/wordml/word16du" xmlns:w16="http://schemas.microsoft.com/office/word/2018/wordml" xmlns:w16cex="http://schemas.microsoft.com/office/word/2018/wordml/cex" xmlns:oel="http://schemas.microsoft.com/office/2019/extlst">
-                  <w:pict>
-                    <v:rect w14:anchorId="60B3D610" id="Rectangle 12" o:spid="_x0000_s1042" style="position:absolute;left:0;text-align:left;margin-left:20.15pt;margin-top:8.35pt;width:12.75pt;height:7.15pt;z-index:251681792;visibility:visible;mso-wrap-style:square;mso-width-percent:0;mso-height-percent:0;mso-wrap-distance-left:9pt;mso-wrap-distance-top:0;mso-wrap-distance-right:9pt;mso-wrap-distance-bottom:0;mso-position-horizontal:absolute;mso-position-horizontal-relative:text;mso-position-vertical:absolute;mso-position-vertical-relative:text;mso-width-percent:0;mso-height-percent:0;mso-width-relative:page;mso-height-relative:page;v-text-anchor:top" o:gfxdata="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">
-                      <v:textbox>
-                        <w:txbxContent>
-                          <w:p/>
-                        </w:txbxContent>
-                      </v:textbox>
-                    </v:rect>
-                  </w:pict>
-                </mc:Fallback>
-              </mc:AlternateContent>
-            </w:r>
-            <w:r>
-              <w:rPr>
-                <w:noProof/>
-                <w:sz w:val="24"/>
-                <w:szCs w:val="24"/>
-                <w:lang w:val="en-IN" w:eastAsia="en-IN"/>
-              </w:rPr>
-              <mc:AlternateContent>
-                <mc:Choice Requires="wps">
-                  <w:drawing>
-                    <wp:anchor distT="0" distB="0" distL="114300" distR="114300" simplePos="0" relativeHeight="251680768" behindDoc="0" locked="0" layoutInCell="1" allowOverlap="1" wp14:anchorId="6E27FEA0" wp14:editId="57BCB15E">
-                      <wp:simplePos x="0" y="0"/>
-                      <wp:positionH relativeFrom="column">
-                        <wp:posOffset>2037080</wp:posOffset>
-                      </wp:positionH>
-                      <wp:positionV relativeFrom="paragraph">
-                        <wp:posOffset>15240</wp:posOffset>
-                      </wp:positionV>
-                      <wp:extent cx="161925" cy="90805"/>
-                      <wp:effectExtent l="19050" t="24765" r="38100" b="46355"/>
-                      <wp:wrapNone/>
-                      <wp:docPr id="860629773" name="Rectangle 11"/>
-                      <wp:cNvGraphicFramePr>
-                        <a:graphicFrameLocks xmlns:a="http://schemas.openxmlformats.org/drawingml/2006/main"/>
-                      </wp:cNvGraphicFramePr>
-                      <a:graphic xmlns:a="http://schemas.openxmlformats.org/drawingml/2006/main">
-                        <a:graphicData uri="http://schemas.microsoft.com/office/word/2010/wordprocessingShape">
-                          <wps:wsp>
-                            <wps:cNvSpPr>
-                              <a:spLocks noChangeArrowheads="1"/>
-                            </wps:cNvSpPr>
-                            <wps:spPr bwMode="auto">
-                              <a:xfrm>
-                                <a:off x="0" y="0"/>
-                                <a:ext cx="161925" cy="90805"/>
-                              </a:xfrm>
-                              <a:prstGeom prst="rect">
-                                <a:avLst/>
-                              </a:prstGeom>
-                              <a:solidFill>
-                                <a:srgbClr val="000000"/>
-                              </a:solidFill>
-                              <a:ln w="38100">
-                                <a:solidFill>
-                                  <a:srgbClr val="F2F2F2"/>
-                                </a:solidFill>
-                                <a:miter lim="800000"/>
-                                <a:headEnd/>
-                                <a:tailEnd/>
-                              </a:ln>
-                              <a:effectLst>
-                                <a:outerShdw dist="28398" dir="3806097" algn="ctr" rotWithShape="0">
-                                  <a:srgbClr val="7F7F7F">
-                                    <a:alpha val="50000"/>
-                                  </a:srgbClr>
-                                </a:outerShdw>
-                              </a:effectLst>
-                            </wps:spPr>
-                            <wps:txbx>
-                              <w:txbxContent>
-                                <w:p/>
-                              </w:txbxContent>
-                            </wps:txbx>
-                            <wps:bodyPr rot="0" vert="horz" wrap="square" lIns="91440" tIns="45720" rIns="91440" bIns="45720" anchor="t" anchorCtr="0" upright="1">
-                              <a:noAutofit/>
-                            </wps:bodyPr>
-                          </wps:wsp>
-                        </a:graphicData>
-                      </a:graphic>
-                      <wp14:sizeRelH relativeFrom="page">
-                        <wp14:pctWidth>0</wp14:pctWidth>
-                      </wp14:sizeRelH>
-                      <wp14:sizeRelV relativeFrom="page">
-                        <wp14:pctHeight>0</wp14:pctHeight>
-                      </wp14:sizeRelV>
-                    </wp:anchor>
-                  </w:drawing>
-                </mc:Choice>
-                <mc:Fallback xmlns:w16sdtfl="http://schemas.microsoft.com/office/word/2024/wordml/sdtformatlock" xmlns:w16sdtdh="http://schemas.microsoft.com/office/word/2020/wordml/sdtdatahash" xmlns:w16du="http://schemas.microsoft.com/office/word/2023/wordml/word16du" xmlns:w16="http://schemas.microsoft.com/office/word/2018/wordml" xmlns:w16cex="http://schemas.microsoft.com/office/word/2018/wordml/cex" xmlns:oel="http://schemas.microsoft.com/office/2019/extlst">
-                  <w:pict>
-                    <v:rect w14:anchorId="6E27FEA0" id="Rectangle 11" o:spid="_x0000_s1043" style="position:absolute;left:0;text-align:left;margin-left:160.4pt;margin-top:1.2pt;width:12.75pt;height:7.15pt;z-index:251680768;visibility:visible;mso-wrap-style:square;mso-width-percent:0;mso-height-percent:0;mso-wrap-distance-left:9pt;mso-wrap-distance-top:0;mso-wrap-distance-right:9pt;mso-wrap-distance-bottom:0;mso-position-horizontal:absolute;mso-position-horizontal-relative:text;mso-position-vertical:absolute;mso-position-vertical-relative:text;mso-width-percent:0;mso-height-percent:0;mso-width-relative:page;mso-height-relative:page;v-text-anchor:top" o:gfxdata="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" fillcolor="black" strokecolor="#f2f2f2" strokeweight="3pt">
-                      <v:shadow on="t" color="#7f7f7f" opacity=".5" offset="1pt"/>
-                      <v:textbox>
-                        <w:txbxContent>
-                          <w:p/>
-                        </w:txbxContent>
-                      </v:textbox>
-                    </v:rect>
-                  </w:pict>
-                </mc:Fallback>
-              </mc:AlternateContent>
-            </w:r>
-            <w:r>
-              <w:rPr>
-                <w:noProof/>
-                <w:sz w:val="24"/>
-                <w:szCs w:val="24"/>
-                <w:lang w:val="en-IN" w:eastAsia="en-IN"/>
-              </w:rPr>
-              <mc:AlternateContent>
-                <mc:Choice Requires="wps">
-                  <w:drawing>
-                    <wp:anchor distT="0" distB="0" distL="114300" distR="114300" simplePos="0" relativeHeight="251679744" behindDoc="0" locked="0" layoutInCell="1" allowOverlap="1" wp14:anchorId="0F601FA9" wp14:editId="579E3BBE">
-                      <wp:simplePos x="0" y="0"/>
-                      <wp:positionH relativeFrom="column">
-                        <wp:posOffset>1207770</wp:posOffset>
-                      </wp:positionH>
-                      <wp:positionV relativeFrom="paragraph">
-                        <wp:posOffset>15240</wp:posOffset>
-                      </wp:positionV>
-                      <wp:extent cx="161925" cy="90805"/>
-                      <wp:effectExtent l="8890" t="5715" r="10160" b="8255"/>
-                      <wp:wrapNone/>
-                      <wp:docPr id="433330610" name="Rectangle 10"/>
-                      <wp:cNvGraphicFramePr>
-                        <a:graphicFrameLocks xmlns:a="http://schemas.openxmlformats.org/drawingml/2006/main"/>
-                      </wp:cNvGraphicFramePr>
-                      <a:graphic xmlns:a="http://schemas.openxmlformats.org/drawingml/2006/main">
-                        <a:graphicData uri="http://schemas.microsoft.com/office/word/2010/wordprocessingShape">
-                          <wps:wsp>
-                            <wps:cNvSpPr>
-                              <a:spLocks noChangeArrowheads="1"/>
-                            </wps:cNvSpPr>
-                            <wps:spPr bwMode="auto">
-                              <a:xfrm>
-                                <a:off x="0" y="0"/>
-                                <a:ext cx="161925" cy="90805"/>
-                              </a:xfrm>
-                              <a:prstGeom prst="rect">
-                                <a:avLst/>
-                              </a:prstGeom>
-                              <a:solidFill>
-                                <a:srgbClr val="FFFFFF"/>
-                              </a:solidFill>
-                              <a:ln w="9525">
-                                <a:solidFill>
-                                  <a:srgbClr val="000000"/>
-                                </a:solidFill>
-                                <a:miter lim="800000"/>
-                                <a:headEnd/>
-                                <a:tailEnd/>
-                              </a:ln>
-                            </wps:spPr>
-                            <wps:txbx>
-                              <w:txbxContent>
-                                <w:p/>
-                              </w:txbxContent>
-                            </wps:txbx>
-                            <wps:bodyPr rot="0" vert="horz" wrap="square" lIns="91440" tIns="45720" rIns="91440" bIns="45720" anchor="t" anchorCtr="0" upright="1">
-                              <a:noAutofit/>
-                            </wps:bodyPr>
-                          </wps:wsp>
-                        </a:graphicData>
-                      </a:graphic>
-                      <wp14:sizeRelH relativeFrom="page">
-                        <wp14:pctWidth>0</wp14:pctWidth>
-                      </wp14:sizeRelH>
-                      <wp14:sizeRelV relativeFrom="page">
-                        <wp14:pctHeight>0</wp14:pctHeight>
-                      </wp14:sizeRelV>
-                    </wp:anchor>
-                  </w:drawing>
-                </mc:Choice>
-                <mc:Fallback xmlns:w16sdtfl="http://schemas.microsoft.com/office/word/2024/wordml/sdtformatlock" xmlns:w16sdtdh="http://schemas.microsoft.com/office/word/2020/wordml/sdtdatahash" xmlns:w16du="http://schemas.microsoft.com/office/word/2023/wordml/word16du" xmlns:w16="http://schemas.microsoft.com/office/word/2018/wordml" xmlns:w16cex="http://schemas.microsoft.com/office/word/2018/wordml/cex" xmlns:oel="http://schemas.microsoft.com/office/2019/extlst">
-                  <w:pict>
-                    <v:rect w14:anchorId="0F601FA9" id="Rectangle 10" o:spid="_x0000_s1044" style="position:absolute;left:0;text-align:left;margin-left:95.1pt;margin-top:1.2pt;width:12.75pt;height:7.15pt;z-index:251679744;visibility:visible;mso-wrap-style:square;mso-width-percent:0;mso-height-percent:0;mso-wrap-distance-left:9pt;mso-wrap-distance-top:0;mso-wrap-distance-right:9pt;mso-wrap-distance-bottom:0;mso-position-horizontal:absolute;mso-position-horizontal-relative:text;mso-position-vertical:absolute;mso-position-vertical-relative:text;mso-width-percent:0;mso-height-percent:0;mso-width-relative:page;mso-height-relative:page;v-text-anchor:top" o:gfxdata="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">
-                      <v:textbox>
-                        <w:txbxContent>
-                          <w:p/>
-                        </w:txbxContent>
-                      </v:textbox>
-                    </v:rect>
-                  </w:pict>
-                </mc:Fallback>
-              </mc:AlternateContent>
-            </w:r>
-            <w:r>
-              <w:rPr>
-                <w:sz w:val="24"/>
-                <w:szCs w:val="24"/>
-              </w:rPr>
-              <w:t xml:space="preserve"> </w:t>
-            </w:r>
-          </w:p>
-          <w:p>
-            <w:pPr>
-              <w:spacing w:after="0" w:line="240" w:lineRule="auto"/>
-              <w:rPr>
-                <w:i/>
-                <w:sz w:val="24"/>
-                <w:szCs w:val="24"/>
-              </w:rPr>
-            </w:pPr>
-            <w:r>
-              <w:rPr>
-                <w:sz w:val="24"/>
-                <w:szCs w:val="24"/>
-              </w:rPr>
-              <w:t>Others (</w:t>
-            </w:r>
-            <w:r>
-              <w:rPr>
-                <w:i/>
-                <w:sz w:val="24"/>
-                <w:szCs w:val="24"/>
-              </w:rPr>
-              <w:t>Please specify:)</w:t>
-            </w:r>
-          </w:p>
-          <w:p>
-            <w:pPr>
-              <w:spacing w:after="0" w:line="240" w:lineRule="auto"/>
-              <w:rPr>
-                <w:sz w:val="24"/>
-                <w:szCs w:val="24"/>
-              </w:rPr>
-            </w:pPr>
-            <w:r>
-              <w:rPr>
-                <w:noProof/>
-                <w:sz w:val="24"/>
-                <w:szCs w:val="24"/>
-                <w:lang w:val="en-IN" w:eastAsia="en-IN"/>
-              </w:rPr>
-              <mc:AlternateContent>
-                <mc:Choice Requires="wps">
-                  <w:drawing>
-                    <wp:anchor distT="0" distB="0" distL="114300" distR="114300" simplePos="0" relativeHeight="251682816" behindDoc="0" locked="0" layoutInCell="1" allowOverlap="1" wp14:anchorId="75AB60A5" wp14:editId="7C3AB5EA">
-                      <wp:simplePos x="0" y="0"/>
-                      <wp:positionH relativeFrom="column">
-                        <wp:posOffset>169545</wp:posOffset>
-                      </wp:positionH>
-                      <wp:positionV relativeFrom="paragraph">
-                        <wp:posOffset>29210</wp:posOffset>
-                      </wp:positionV>
-                      <wp:extent cx="161925" cy="90805"/>
-                      <wp:effectExtent l="8890" t="10795" r="10160" b="12700"/>
-                      <wp:wrapNone/>
-                      <wp:docPr id="1175551109" name="Rectangle 9"/>
-                      <wp:cNvGraphicFramePr>
-                        <a:graphicFrameLocks xmlns:a="http://schemas.openxmlformats.org/drawingml/2006/main"/>
-                      </wp:cNvGraphicFramePr>
-                      <a:graphic xmlns:a="http://schemas.openxmlformats.org/drawingml/2006/main">
-                        <a:graphicData uri="http://schemas.microsoft.com/office/word/2010/wordprocessingShape">
-                          <wps:wsp>
-                            <wps:cNvSpPr>
-                              <a:spLocks noChangeArrowheads="1"/>
-                            </wps:cNvSpPr>
-                            <wps:spPr bwMode="auto">
-                              <a:xfrm>
-                                <a:off x="0" y="0"/>
-                                <a:ext cx="161925" cy="90805"/>
-                              </a:xfrm>
-                              <a:prstGeom prst="rect">
-                                <a:avLst/>
-                              </a:prstGeom>
-                              <a:solidFill>
-                                <a:srgbClr val="FFFFFF"/>
-                              </a:solidFill>
-                              <a:ln w="9525">
-                                <a:solidFill>
-                                  <a:srgbClr val="000000"/>
-                                </a:solidFill>
-                                <a:miter lim="800000"/>
-                                <a:headEnd/>
-                                <a:tailEnd/>
-                              </a:ln>
-                            </wps:spPr>
-                            <wps:txbx>
-                              <w:txbxContent>
-                                <w:p/>
-                              </w:txbxContent>
-                            </wps:txbx>
-                            <wps:bodyPr rot="0" vert="horz" wrap="square" lIns="91440" tIns="45720" rIns="91440" bIns="45720" anchor="t" anchorCtr="0" upright="1">
-                              <a:noAutofit/>
-                            </wps:bodyPr>
-                          </wps:wsp>
-                        </a:graphicData>
-                      </a:graphic>
-                      <wp14:sizeRelH relativeFrom="page">
-                        <wp14:pctWidth>0</wp14:pctWidth>
-                      </wp14:sizeRelH>
-                      <wp14:sizeRelV relativeFrom="page">
-                        <wp14:pctHeight>0</wp14:pctHeight>
-                      </wp14:sizeRelV>
-                    </wp:anchor>
-                  </w:drawing>
-                </mc:Choice>
-                <mc:Fallback xmlns:w16sdtfl="http://schemas.microsoft.com/office/word/2024/wordml/sdtformatlock" xmlns:w16sdtdh="http://schemas.microsoft.com/office/word/2020/wordml/sdtdatahash" xmlns:w16du="http://schemas.microsoft.com/office/word/2023/wordml/word16du" xmlns:w16="http://schemas.microsoft.com/office/word/2018/wordml" xmlns:w16cex="http://schemas.microsoft.com/office/word/2018/wordml/cex" xmlns:oel="http://schemas.microsoft.com/office/2019/extlst">
-                  <w:pict>
-                    <v:rect w14:anchorId="75AB60A5" id="Rectangle 9" o:spid="_x0000_s1045" style="position:absolute;left:0;text-align:left;margin-left:13.35pt;margin-top:2.3pt;width:12.75pt;height:7.15pt;z-index:251682816;visibility:visible;mso-wrap-style:square;mso-width-percent:0;mso-height-percent:0;mso-wrap-distance-left:9pt;mso-wrap-distance-top:0;mso-wrap-distance-right:9pt;mso-wrap-distance-bottom:0;mso-position-horizontal:absolute;mso-position-horizontal-relative:text;mso-position-vertical:absolute;mso-position-vertical-relative:text;mso-width-percent:0;mso-height-percent:0;mso-width-relative:page;mso-height-relative:page;v-text-anchor:top" o:gfxdata="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">
-                      <v:textbox>
-                        <w:txbxContent>
-                          <w:p/>
-                        </w:txbxContent>
-                      </v:textbox>
-                    </v:rect>
-                  </w:pict>
-                </mc:Fallback>
-              </mc:AlternateContent>
-            </w:r>
-            <w:r>
-              <w:rPr>
-                <w:sz w:val="24"/>
-                <w:szCs w:val="24"/>
-              </w:rPr>
-              <w:t xml:space="preserve">    </w:t>
+              <w:ind w:left="0"/>
+              <w:rPr>
+                <w:sz w:val="24"/>
+                <w:szCs w:val="24"/>
+              </w:rPr>
+            </w:pPr>
+            <w:r>
+              <w:rPr>
+                <w:sz w:val="24"/>
+                <w:szCs w:val="24"/>
+              </w:rPr>
+              <w:t xml:space="preserve">{{ '☒' if land_revenue_type_other else '☐' }} Others (Please specify: {{ land_revenue_type_other }})</w:t>
             </w:r>
           </w:p>
         </w:tc>
@@ -3848,541 +2025,24 @@
                 <w:sz w:val="24"/>
                 <w:szCs w:val="24"/>
               </w:rPr>
-              <w:t>Freehold          Leasehold          Govt. land</w:t>
-            </w:r>
-          </w:p>
-          <w:p>
-            <w:pPr>
-              <w:spacing w:after="0" w:line="240" w:lineRule="auto"/>
-              <w:rPr>
-                <w:sz w:val="24"/>
-                <w:szCs w:val="24"/>
-              </w:rPr>
-            </w:pPr>
-            <w:r>
-              <w:rPr>
-                <w:noProof/>
-                <w:sz w:val="24"/>
-                <w:szCs w:val="24"/>
-                <w:lang w:val="en-IN" w:eastAsia="en-IN"/>
-              </w:rPr>
-              <mc:AlternateContent>
-                <mc:Choice Requires="wps">
-                  <w:drawing>
-                    <wp:anchor distT="0" distB="0" distL="114300" distR="114300" simplePos="0" relativeHeight="251675648" behindDoc="0" locked="0" layoutInCell="1" allowOverlap="1" wp14:anchorId="4AA79A5E" wp14:editId="7F571CF7">
-                      <wp:simplePos x="0" y="0"/>
-                      <wp:positionH relativeFrom="column">
-                        <wp:posOffset>93980</wp:posOffset>
-                      </wp:positionH>
-                      <wp:positionV relativeFrom="paragraph">
-                        <wp:posOffset>106045</wp:posOffset>
-                      </wp:positionV>
-                      <wp:extent cx="161925" cy="90805"/>
-                      <wp:effectExtent l="19050" t="27940" r="38100" b="52705"/>
-                      <wp:wrapNone/>
-                      <wp:docPr id="1953484479" name="Rectangle 8"/>
-                      <wp:cNvGraphicFramePr>
-                        <a:graphicFrameLocks xmlns:a="http://schemas.openxmlformats.org/drawingml/2006/main"/>
-                      </wp:cNvGraphicFramePr>
-                      <a:graphic xmlns:a="http://schemas.openxmlformats.org/drawingml/2006/main">
-                        <a:graphicData uri="http://schemas.microsoft.com/office/word/2010/wordprocessingShape">
-                          <wps:wsp>
-                            <wps:cNvSpPr>
-                              <a:spLocks noChangeArrowheads="1"/>
-                            </wps:cNvSpPr>
-                            <wps:spPr bwMode="auto">
-                              <a:xfrm>
-                                <a:off x="0" y="0"/>
-                                <a:ext cx="161925" cy="90805"/>
-                              </a:xfrm>
-                              <a:prstGeom prst="rect">
-                                <a:avLst/>
-                              </a:prstGeom>
-                              <a:solidFill>
-                                <a:srgbClr val="000000"/>
-                              </a:solidFill>
-                              <a:ln w="38100">
-                                <a:solidFill>
-                                  <a:srgbClr val="F2F2F2"/>
-                                </a:solidFill>
-                                <a:miter lim="800000"/>
-                                <a:headEnd/>
-                                <a:tailEnd/>
-                              </a:ln>
-                              <a:effectLst>
-                                <a:outerShdw dist="28398" dir="3806097" algn="ctr" rotWithShape="0">
-                                  <a:srgbClr val="7F7F7F">
-                                    <a:alpha val="50000"/>
-                                  </a:srgbClr>
-                                </a:outerShdw>
-                              </a:effectLst>
-                            </wps:spPr>
-                            <wps:txbx>
-                              <w:txbxContent>
-                                <w:p>
-                                  <w:pPr>
-                                    <w:rPr>
-                                      <w:color w:val="000000"/>
-                                    </w:rPr>
-                                  </w:pPr>
-                                  <w:r>
-                                    <w:rPr>
-                                      <w:noProof/>
-                                      <w:color w:val="000000"/>
-                                      <w:highlight w:val="black"/>
-                                    </w:rPr>
-                                    <w:drawing>
-                                      <wp:inline distT="0" distB="0" distL="0" distR="0" wp14:anchorId="2B6A2C2F" wp14:editId="7416C02B">
-                                        <wp:extent cx="9525" cy="9525"/>
-                                        <wp:effectExtent l="0" t="0" r="0" b="0"/>
-                                        <wp:docPr id="588764555" name="Picture 588764555"/>
-                                        <wp:cNvGraphicFramePr>
-                                          <a:graphicFrameLocks xmlns:a="http://schemas.openxmlformats.org/drawingml/2006/main" noChangeAspect="1"/>
-                                        </wp:cNvGraphicFramePr>
-                                        <a:graphic xmlns:a="http://schemas.openxmlformats.org/drawingml/2006/main">
-                                          <a:graphicData uri="http://schemas.openxmlformats.org/drawingml/2006/picture">
-                                            <pic:pic xmlns:pic="http://schemas.openxmlformats.org/drawingml/2006/picture">
-                                              <pic:nvPicPr>
-                                                <pic:cNvPr id="0" name="Picture 1"/>
-                                                <pic:cNvPicPr>
-                                                  <a:picLocks noChangeAspect="1" noChangeArrowheads="1"/>
-                                                </pic:cNvPicPr>
-                                              </pic:nvPicPr>
-                                              <pic:blipFill>
-                                                <a:blip r:embed="rId8">
-                                                  <a:extLst>
-                                                    <a:ext uri="{28A0092B-C50C-407E-A947-70E740481C1C}">
-                                                      <a14:useLocalDpi xmlns:a14="http://schemas.microsoft.com/office/drawing/2010/main" val="0"/>
-                                                    </a:ext>
-                                                  </a:extLst>
-                                                </a:blip>
-                                                <a:srcRect/>
-                                                <a:stretch>
-                                                  <a:fillRect/>
-                                                </a:stretch>
-                                              </pic:blipFill>
-                                              <pic:spPr bwMode="auto">
-                                                <a:xfrm>
-                                                  <a:off x="0" y="0"/>
-                                                  <a:ext cx="9525" cy="9525"/>
-                                                </a:xfrm>
-                                                <a:prstGeom prst="rect">
-                                                  <a:avLst/>
-                                                </a:prstGeom>
-                                                <a:noFill/>
-                                                <a:ln>
-                                                  <a:noFill/>
-                                                </a:ln>
-                                              </pic:spPr>
-                                            </pic:pic>
-                                          </a:graphicData>
-                                        </a:graphic>
-                                      </wp:inline>
-                                    </w:drawing>
-                                  </w:r>
-                                </w:p>
-                              </w:txbxContent>
-                            </wps:txbx>
-                            <wps:bodyPr rot="0" vert="horz" wrap="square" lIns="91440" tIns="45720" rIns="91440" bIns="45720" anchor="t" anchorCtr="0" upright="1">
-                              <a:noAutofit/>
-                            </wps:bodyPr>
-                          </wps:wsp>
-                        </a:graphicData>
-                      </a:graphic>
-                      <wp14:sizeRelH relativeFrom="page">
-                        <wp14:pctWidth>0</wp14:pctWidth>
-                      </wp14:sizeRelH>
-                      <wp14:sizeRelV relativeFrom="page">
-                        <wp14:pctHeight>0</wp14:pctHeight>
-                      </wp14:sizeRelV>
-                    </wp:anchor>
-                  </w:drawing>
-                </mc:Choice>
-                <mc:Fallback xmlns:w16sdtfl="http://schemas.microsoft.com/office/word/2024/wordml/sdtformatlock" xmlns:w16sdtdh="http://schemas.microsoft.com/office/word/2020/wordml/sdtdatahash" xmlns:w16du="http://schemas.microsoft.com/office/word/2023/wordml/word16du" xmlns:w16="http://schemas.microsoft.com/office/word/2018/wordml" xmlns:w16cex="http://schemas.microsoft.com/office/word/2018/wordml/cex" xmlns:oel="http://schemas.microsoft.com/office/2019/extlst">
-                  <w:pict>
-                    <v:rect w14:anchorId="4AA79A5E" id="Rectangle 8" o:spid="_x0000_s1046" style="position:absolute;left:0;text-align:left;margin-left:7.4pt;margin-top:8.35pt;width:12.75pt;height:7.15pt;z-index:251675648;visibility:visible;mso-wrap-style:square;mso-width-percent:0;mso-height-percent:0;mso-wrap-distance-left:9pt;mso-wrap-distance-top:0;mso-wrap-distance-right:9pt;mso-wrap-distance-bottom:0;mso-position-horizontal:absolute;mso-position-horizontal-relative:text;mso-position-vertical:absolute;mso-position-vertical-relative:text;mso-width-percent:0;mso-height-percent:0;mso-width-relative:page;mso-height-relative:page;v-text-anchor:top" o:gfxdata="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" fillcolor="black" strokecolor="#f2f2f2" strokeweight="3pt">
-                      <v:shadow on="t" color="#7f7f7f" opacity=".5" offset="1pt"/>
-                      <v:textbox>
-                        <w:txbxContent>
-                          <w:p>
-                            <w:pPr>
-                              <w:rPr>
-                                <w:color w:val="000000"/>
-                              </w:rPr>
-                            </w:pPr>
-                            <w:r>
-                              <w:rPr>
-                                <w:noProof/>
-                                <w:color w:val="000000"/>
-                                <w:highlight w:val="black"/>
-                              </w:rPr>
-                              <w:drawing>
-                                <wp:inline distT="0" distB="0" distL="0" distR="0" wp14:anchorId="2B6A2C2F" wp14:editId="7416C02B">
-                                  <wp:extent cx="9525" cy="9525"/>
-                                  <wp:effectExtent l="0" t="0" r="0" b="0"/>
-                                  <wp:docPr id="588764555" name="Picture 588764555"/>
-                                  <wp:cNvGraphicFramePr>
-                                    <a:graphicFrameLocks xmlns:a="http://schemas.openxmlformats.org/drawingml/2006/main" noChangeAspect="1"/>
-                                  </wp:cNvGraphicFramePr>
-                                  <a:graphic xmlns:a="http://schemas.openxmlformats.org/drawingml/2006/main">
-                                    <a:graphicData uri="http://schemas.openxmlformats.org/drawingml/2006/picture">
-                                      <pic:pic xmlns:pic="http://schemas.openxmlformats.org/drawingml/2006/picture">
-                                        <pic:nvPicPr>
-                                          <pic:cNvPr id="0" name="Picture 1"/>
-                                          <pic:cNvPicPr>
-                                            <a:picLocks noChangeAspect="1" noChangeArrowheads="1"/>
-                                          </pic:cNvPicPr>
-                                        </pic:nvPicPr>
-                                        <pic:blipFill>
-                                          <a:blip r:embed="rId9">
-                                            <a:extLst>
-                                              <a:ext uri="{28A0092B-C50C-407E-A947-70E740481C1C}">
-                                                <a14:useLocalDpi xmlns:a14="http://schemas.microsoft.com/office/drawing/2010/main" val="0"/>
-                                              </a:ext>
-                                            </a:extLst>
-                                          </a:blip>
-                                          <a:srcRect/>
-                                          <a:stretch>
-                                            <a:fillRect/>
-                                          </a:stretch>
-                                        </pic:blipFill>
-                                        <pic:spPr bwMode="auto">
-                                          <a:xfrm>
-                                            <a:off x="0" y="0"/>
-                                            <a:ext cx="9525" cy="9525"/>
-                                          </a:xfrm>
-                                          <a:prstGeom prst="rect">
-                                            <a:avLst/>
-                                          </a:prstGeom>
-                                          <a:noFill/>
-                                          <a:ln>
-                                            <a:noFill/>
-                                          </a:ln>
-                                        </pic:spPr>
-                                      </pic:pic>
-                                    </a:graphicData>
-                                  </a:graphic>
-                                </wp:inline>
-                              </w:drawing>
-                            </w:r>
-                          </w:p>
-                        </w:txbxContent>
-                      </v:textbox>
-                    </v:rect>
-                  </w:pict>
-                </mc:Fallback>
-              </mc:AlternateContent>
-            </w:r>
-            <w:r>
-              <w:rPr>
-                <w:noProof/>
-                <w:sz w:val="24"/>
-                <w:szCs w:val="24"/>
-                <w:lang w:val="en-IN" w:eastAsia="en-IN"/>
-              </w:rPr>
-              <mc:AlternateContent>
-                <mc:Choice Requires="wps">
-                  <w:drawing>
-                    <wp:anchor distT="0" distB="0" distL="114300" distR="114300" simplePos="0" relativeHeight="251677696" behindDoc="0" locked="0" layoutInCell="1" allowOverlap="1" wp14:anchorId="1AD9EEE1" wp14:editId="1C5E47DB">
-                      <wp:simplePos x="0" y="0"/>
-                      <wp:positionH relativeFrom="column">
-                        <wp:posOffset>2274570</wp:posOffset>
-                      </wp:positionH>
-                      <wp:positionV relativeFrom="paragraph">
-                        <wp:posOffset>15240</wp:posOffset>
-                      </wp:positionV>
-                      <wp:extent cx="161925" cy="90805"/>
-                      <wp:effectExtent l="8890" t="13335" r="10160" b="10160"/>
-                      <wp:wrapNone/>
-                      <wp:docPr id="1506849911" name="Rectangle 6"/>
-                      <wp:cNvGraphicFramePr>
-                        <a:graphicFrameLocks xmlns:a="http://schemas.openxmlformats.org/drawingml/2006/main"/>
-                      </wp:cNvGraphicFramePr>
-                      <a:graphic xmlns:a="http://schemas.openxmlformats.org/drawingml/2006/main">
-                        <a:graphicData uri="http://schemas.microsoft.com/office/word/2010/wordprocessingShape">
-                          <wps:wsp>
-                            <wps:cNvSpPr>
-                              <a:spLocks noChangeArrowheads="1"/>
-                            </wps:cNvSpPr>
-                            <wps:spPr bwMode="auto">
-                              <a:xfrm>
-                                <a:off x="0" y="0"/>
-                                <a:ext cx="161925" cy="90805"/>
-                              </a:xfrm>
-                              <a:prstGeom prst="rect">
-                                <a:avLst/>
-                              </a:prstGeom>
-                              <a:solidFill>
-                                <a:srgbClr val="FFFFFF"/>
-                              </a:solidFill>
-                              <a:ln w="9525">
-                                <a:solidFill>
-                                  <a:srgbClr val="000000"/>
-                                </a:solidFill>
-                                <a:miter lim="800000"/>
-                                <a:headEnd/>
-                                <a:tailEnd/>
-                              </a:ln>
-                            </wps:spPr>
-                            <wps:txbx>
-                              <w:txbxContent>
-                                <w:p/>
-                              </w:txbxContent>
-                            </wps:txbx>
-                            <wps:bodyPr rot="0" vert="horz" wrap="square" lIns="91440" tIns="45720" rIns="91440" bIns="45720" anchor="t" anchorCtr="0" upright="1">
-                              <a:noAutofit/>
-                            </wps:bodyPr>
-                          </wps:wsp>
-                        </a:graphicData>
-                      </a:graphic>
-                      <wp14:sizeRelH relativeFrom="page">
-                        <wp14:pctWidth>0</wp14:pctWidth>
-                      </wp14:sizeRelH>
-                      <wp14:sizeRelV relativeFrom="page">
-                        <wp14:pctHeight>0</wp14:pctHeight>
-                      </wp14:sizeRelV>
-                    </wp:anchor>
-                  </w:drawing>
-                </mc:Choice>
-                <mc:Fallback xmlns:w16sdtfl="http://schemas.microsoft.com/office/word/2024/wordml/sdtformatlock" xmlns:w16sdtdh="http://schemas.microsoft.com/office/word/2020/wordml/sdtdatahash" xmlns:w16du="http://schemas.microsoft.com/office/word/2023/wordml/word16du" xmlns:w16="http://schemas.microsoft.com/office/word/2018/wordml" xmlns:w16cex="http://schemas.microsoft.com/office/word/2018/wordml/cex" xmlns:oel="http://schemas.microsoft.com/office/2019/extlst">
-                  <w:pict>
-                    <v:rect w14:anchorId="1AD9EEE1" id="Rectangle 6" o:spid="_x0000_s1047" style="position:absolute;left:0;text-align:left;margin-left:179.1pt;margin-top:1.2pt;width:12.75pt;height:7.15pt;z-index:251677696;visibility:visible;mso-wrap-style:square;mso-width-percent:0;mso-height-percent:0;mso-wrap-distance-left:9pt;mso-wrap-distance-top:0;mso-wrap-distance-right:9pt;mso-wrap-distance-bottom:0;mso-position-horizontal:absolute;mso-position-horizontal-relative:text;mso-position-vertical:absolute;mso-position-vertical-relative:text;mso-width-percent:0;mso-height-percent:0;mso-width-relative:page;mso-height-relative:page;v-text-anchor:top" o:gfxdata="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">
-                      <v:textbox>
-                        <w:txbxContent>
-                          <w:p/>
-                        </w:txbxContent>
-                      </v:textbox>
-                    </v:rect>
-                  </w:pict>
-                </mc:Fallback>
-              </mc:AlternateContent>
-            </w:r>
-            <w:r>
-              <w:rPr>
-                <w:noProof/>
-                <w:sz w:val="24"/>
-                <w:szCs w:val="24"/>
-                <w:lang w:val="en-IN" w:eastAsia="en-IN"/>
-              </w:rPr>
-              <mc:AlternateContent>
-                <mc:Choice Requires="wps">
-                  <w:drawing>
-                    <wp:anchor distT="0" distB="0" distL="114300" distR="114300" simplePos="0" relativeHeight="251676672" behindDoc="0" locked="0" layoutInCell="1" allowOverlap="1" wp14:anchorId="35ADE257" wp14:editId="72756BA0">
-                      <wp:simplePos x="0" y="0"/>
-                      <wp:positionH relativeFrom="column">
-                        <wp:posOffset>1112520</wp:posOffset>
-                      </wp:positionH>
-                      <wp:positionV relativeFrom="paragraph">
-                        <wp:posOffset>36195</wp:posOffset>
-                      </wp:positionV>
-                      <wp:extent cx="161925" cy="90805"/>
-                      <wp:effectExtent l="8890" t="5715" r="10160" b="8255"/>
-                      <wp:wrapNone/>
-                      <wp:docPr id="659706085" name="Rectangle 5"/>
-                      <wp:cNvGraphicFramePr>
-                        <a:graphicFrameLocks xmlns:a="http://schemas.openxmlformats.org/drawingml/2006/main"/>
-                      </wp:cNvGraphicFramePr>
-                      <a:graphic xmlns:a="http://schemas.openxmlformats.org/drawingml/2006/main">
-                        <a:graphicData uri="http://schemas.microsoft.com/office/word/2010/wordprocessingShape">
-                          <wps:wsp>
-                            <wps:cNvSpPr>
-                              <a:spLocks noChangeArrowheads="1"/>
-                            </wps:cNvSpPr>
-                            <wps:spPr bwMode="auto">
-                              <a:xfrm>
-                                <a:off x="0" y="0"/>
-                                <a:ext cx="161925" cy="90805"/>
-                              </a:xfrm>
-                              <a:prstGeom prst="rect">
-                                <a:avLst/>
-                              </a:prstGeom>
-                              <a:solidFill>
-                                <a:srgbClr val="FFFFFF"/>
-                              </a:solidFill>
-                              <a:ln w="9525">
-                                <a:solidFill>
-                                  <a:srgbClr val="000000"/>
-                                </a:solidFill>
-                                <a:miter lim="800000"/>
-                                <a:headEnd/>
-                                <a:tailEnd/>
-                              </a:ln>
-                            </wps:spPr>
-                            <wps:txbx>
-                              <w:txbxContent>
-                                <w:p/>
-                              </w:txbxContent>
-                            </wps:txbx>
-                            <wps:bodyPr rot="0" vert="horz" wrap="square" lIns="91440" tIns="45720" rIns="91440" bIns="45720" anchor="t" anchorCtr="0" upright="1">
-                              <a:noAutofit/>
-                            </wps:bodyPr>
-                          </wps:wsp>
-                        </a:graphicData>
-                      </a:graphic>
-                      <wp14:sizeRelH relativeFrom="page">
-                        <wp14:pctWidth>0</wp14:pctWidth>
-                      </wp14:sizeRelH>
-                      <wp14:sizeRelV relativeFrom="page">
-                        <wp14:pctHeight>0</wp14:pctHeight>
-                      </wp14:sizeRelV>
-                    </wp:anchor>
-                  </w:drawing>
-                </mc:Choice>
-                <mc:Fallback xmlns:w16sdtfl="http://schemas.microsoft.com/office/word/2024/wordml/sdtformatlock" xmlns:w16sdtdh="http://schemas.microsoft.com/office/word/2020/wordml/sdtdatahash" xmlns:w16du="http://schemas.microsoft.com/office/word/2023/wordml/word16du" xmlns:w16="http://schemas.microsoft.com/office/word/2018/wordml" xmlns:w16cex="http://schemas.microsoft.com/office/word/2018/wordml/cex" xmlns:oel="http://schemas.microsoft.com/office/2019/extlst">
-                  <w:pict>
-                    <v:rect w14:anchorId="35ADE257" id="Rectangle 5" o:spid="_x0000_s1048" style="position:absolute;left:0;text-align:left;margin-left:87.6pt;margin-top:2.85pt;width:12.75pt;height:7.15pt;z-index:251676672;visibility:visible;mso-wrap-style:square;mso-width-percent:0;mso-height-percent:0;mso-wrap-distance-left:9pt;mso-wrap-distance-top:0;mso-wrap-distance-right:9pt;mso-wrap-distance-bottom:0;mso-position-horizontal:absolute;mso-position-horizontal-relative:text;mso-position-vertical:absolute;mso-position-vertical-relative:text;mso-width-percent:0;mso-height-percent:0;mso-width-relative:page;mso-height-relative:page;v-text-anchor:top" o:gfxdata="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">
-                      <v:textbox>
-                        <w:txbxContent>
-                          <w:p/>
-                        </w:txbxContent>
-                      </v:textbox>
-                    </v:rect>
-                  </w:pict>
-                </mc:Fallback>
-              </mc:AlternateContent>
-            </w:r>
-            <w:r>
-              <w:rPr>
-                <w:sz w:val="24"/>
-                <w:szCs w:val="24"/>
-              </w:rPr>
-              <w:t xml:space="preserve"> </w:t>
-            </w:r>
-          </w:p>
-          <w:p>
-            <w:pPr>
-              <w:spacing w:after="0" w:line="240" w:lineRule="auto"/>
-              <w:rPr>
-                <w:sz w:val="24"/>
-                <w:szCs w:val="24"/>
-              </w:rPr>
-            </w:pPr>
+              <w:t xml:space="preserve">{{ '☒' if (property_tenure|lower) == 'freehold' else '☐' }} Freehold    {{ '☒' if (property_tenure|lower) == 'leasehold' else '☐' }} Leasehold    {{ '☒' if (property_tenure|lower) == 'govt. land' else '☐' }} Govt. land</w:t>
+            </w:r>
           </w:p>
           <w:p>
             <w:pPr>
               <w:spacing w:after="0" w:line="240" w:lineRule="auto"/>
               <w:ind w:left="0"/>
               <w:rPr>
-                <w:i/>
-                <w:sz w:val="24"/>
-                <w:szCs w:val="24"/>
-              </w:rPr>
-            </w:pPr>
-            <w:r>
-              <w:rPr>
-                <w:sz w:val="24"/>
-                <w:szCs w:val="24"/>
-              </w:rPr>
-              <w:t>Others (</w:t>
-            </w:r>
-            <w:r>
-              <w:rPr>
-                <w:i/>
-                <w:sz w:val="24"/>
-                <w:szCs w:val="24"/>
-              </w:rPr>
-              <w:t>Please specify:)</w:t>
-            </w:r>
-          </w:p>
-          <w:p>
-            <w:pPr>
-              <w:spacing w:after="0" w:line="240" w:lineRule="auto"/>
-              <w:rPr>
-                <w:b w:val="0"/>
-                <w:sz w:val="24"/>
-                <w:szCs w:val="24"/>
-              </w:rPr>
-            </w:pPr>
-            <w:r>
-              <w:rPr>
-                <w:noProof/>
-                <w:sz w:val="24"/>
-                <w:szCs w:val="24"/>
-                <w:lang w:val="en-IN" w:eastAsia="en-IN"/>
-              </w:rPr>
-              <mc:AlternateContent>
-                <mc:Choice Requires="wps">
-                  <w:drawing>
-                    <wp:anchor distT="0" distB="0" distL="114300" distR="114300" simplePos="0" relativeHeight="251678720" behindDoc="0" locked="0" layoutInCell="1" allowOverlap="1" wp14:anchorId="6AD0EAB6" wp14:editId="1020E4DE">
-                      <wp:simplePos x="0" y="0"/>
-                      <wp:positionH relativeFrom="column">
-                        <wp:posOffset>169545</wp:posOffset>
-                      </wp:positionH>
-                      <wp:positionV relativeFrom="paragraph">
-                        <wp:posOffset>29210</wp:posOffset>
-                      </wp:positionV>
-                      <wp:extent cx="161925" cy="90805"/>
-                      <wp:effectExtent l="8890" t="13970" r="10160" b="9525"/>
-                      <wp:wrapNone/>
-                      <wp:docPr id="88411593" name="Rectangle 4"/>
-                      <wp:cNvGraphicFramePr>
-                        <a:graphicFrameLocks xmlns:a="http://schemas.openxmlformats.org/drawingml/2006/main"/>
-                      </wp:cNvGraphicFramePr>
-                      <a:graphic xmlns:a="http://schemas.openxmlformats.org/drawingml/2006/main">
-                        <a:graphicData uri="http://schemas.microsoft.com/office/word/2010/wordprocessingShape">
-                          <wps:wsp>
-                            <wps:cNvSpPr>
-                              <a:spLocks noChangeArrowheads="1"/>
-                            </wps:cNvSpPr>
-                            <wps:spPr bwMode="auto">
-                              <a:xfrm>
-                                <a:off x="0" y="0"/>
-                                <a:ext cx="161925" cy="90805"/>
-                              </a:xfrm>
-                              <a:prstGeom prst="rect">
-                                <a:avLst/>
-                              </a:prstGeom>
-                              <a:solidFill>
-                                <a:srgbClr val="FFFFFF"/>
-                              </a:solidFill>
-                              <a:ln w="9525">
-                                <a:solidFill>
-                                  <a:srgbClr val="000000"/>
-                                </a:solidFill>
-                                <a:miter lim="800000"/>
-                                <a:headEnd/>
-                                <a:tailEnd/>
-                              </a:ln>
-                            </wps:spPr>
-                            <wps:txbx>
-                              <w:txbxContent>
-                                <w:p/>
-                              </w:txbxContent>
-                            </wps:txbx>
-                            <wps:bodyPr rot="0" vert="horz" wrap="square" lIns="91440" tIns="45720" rIns="91440" bIns="45720" anchor="t" anchorCtr="0" upright="1">
-                              <a:noAutofit/>
-                            </wps:bodyPr>
-                          </wps:wsp>
-                        </a:graphicData>
-                      </a:graphic>
-                      <wp14:sizeRelH relativeFrom="page">
-                        <wp14:pctWidth>0</wp14:pctWidth>
-                      </wp14:sizeRelH>
-                      <wp14:sizeRelV relativeFrom="page">
-                        <wp14:pctHeight>0</wp14:pctHeight>
-                      </wp14:sizeRelV>
-                    </wp:anchor>
-                  </w:drawing>
-                </mc:Choice>
-                <mc:Fallback xmlns:w16sdtfl="http://schemas.microsoft.com/office/word/2024/wordml/sdtformatlock" xmlns:w16sdtdh="http://schemas.microsoft.com/office/word/2020/wordml/sdtdatahash" xmlns:w16du="http://schemas.microsoft.com/office/word/2023/wordml/word16du" xmlns:w16="http://schemas.microsoft.com/office/word/2018/wordml" xmlns:w16cex="http://schemas.microsoft.com/office/word/2018/wordml/cex" xmlns:oel="http://schemas.microsoft.com/office/2019/extlst">
-                  <w:pict>
-                    <v:rect w14:anchorId="6AD0EAB6" id="Rectangle 4" o:spid="_x0000_s1049" style="position:absolute;left:0;text-align:left;margin-left:13.35pt;margin-top:2.3pt;width:12.75pt;height:7.15pt;z-index:251678720;visibility:visible;mso-wrap-style:square;mso-width-percent:0;mso-height-percent:0;mso-wrap-distance-left:9pt;mso-wrap-distance-top:0;mso-wrap-distance-right:9pt;mso-wrap-distance-bottom:0;mso-position-horizontal:absolute;mso-position-horizontal-relative:text;mso-position-vertical:absolute;mso-position-vertical-relative:text;mso-width-percent:0;mso-height-percent:0;mso-width-relative:page;mso-height-relative:page;v-text-anchor:top" o:gfxdata="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">
-                      <v:textbox>
-                        <w:txbxContent>
-                          <w:p/>
-                        </w:txbxContent>
-                      </v:textbox>
-                    </v:rect>
-                  </w:pict>
-                </mc:Fallback>
-              </mc:AlternateContent>
-            </w:r>
-            <w:r>
-              <w:rPr>
-                <w:sz w:val="24"/>
-                <w:szCs w:val="24"/>
-              </w:rPr>
-              <w:t xml:space="preserve">    </w:t>
+                <w:sz w:val="24"/>
+                <w:szCs w:val="24"/>
+              </w:rPr>
+            </w:pPr>
+            <w:r>
+              <w:rPr>
+                <w:sz w:val="24"/>
+                <w:szCs w:val="24"/>
+              </w:rPr>
+              <w:t xml:space="preserve">{{ '☒' if property_tenure_other else '☐' }} Others (Please specify: {{ property_tenure_other }})</w:t>
             </w:r>
           </w:p>
         </w:tc>
@@ -4589,7 +2249,7 @@
                 <w:sz w:val="24"/>
                 <w:szCs w:val="24"/>
               </w:rPr>
-              <w:t>Not provided</w:t>
+              <w:t xml:space="preserve">{{ property_tax_payment_status }}</w:t>
             </w:r>
           </w:p>
         </w:tc>
@@ -6019,34 +3679,7 @@
                 <w:bCs/>
                 <w:szCs w:val="24"/>
               </w:rPr>
-              <w:t xml:space="preserve">We find that said Project was registered with RERA vide Certificate dated {{ rera_certificate_date }} bearing no. {{ rera_number }}. </w:t>
-            </w:r>
-            <w:r>
-              <w:rPr>
-                <w:rFonts w:asciiTheme="minorHAnsi" w:hAnsiTheme="minorHAnsi" w:cstheme="minorHAnsi"/>
-                <w:b/>
-                <w:bCs/>
-                <w:szCs w:val="24"/>
-              </w:rPr>
-              <w:t>However,</w:t>
-            </w:r>
-            <w:r>
-              <w:rPr>
-                <w:rFonts w:asciiTheme="minorHAnsi" w:hAnsiTheme="minorHAnsi" w:cstheme="minorHAnsi"/>
-                <w:b/>
-                <w:bCs/>
-                <w:szCs w:val="24"/>
-              </w:rPr>
-              <w:t xml:space="preserve"> validity of the same is expired on </w:t>
-            </w:r>
-            <w:r>
-              <w:rPr>
-                <w:rFonts w:asciiTheme="minorHAnsi" w:hAnsiTheme="minorHAnsi" w:cstheme="minorHAnsi"/>
-                <w:b/>
-                <w:bCs/>
-                <w:szCs w:val="24"/>
-              </w:rPr>
-              <w:t xml:space="preserve">{{ rera_validity_expiry_date }}.</w:t>
+              <w:t xml:space="preserve">{% if rera_number %}We find that said Project was registered with RERA vide Certificate dated {{ rera_certificate_date }} bearing no. {{ rera_number }}.{% if rera_validity_expiry_date %} However, validity of the same is expired on {{ rera_validity_expiry_date }}.{% endif %}{% endif %}</w:t>
             </w:r>
           </w:p>
         </w:tc>
@@ -6283,7 +3916,7 @@
                 <w:szCs w:val="24"/>
                 <w:lang w:bidi="mr-IN"/>
               </w:rPr>
-              <w:t xml:space="preserve">{{ search_challan_date }}</w:t>
+              <w:t xml:space="preserve">{{ search_date }}</w:t>
             </w:r>
             <w:proofErr w:type="gramStart"/>
             <w:r>
@@ -6378,7 +4011,7 @@
                 <w:szCs w:val="24"/>
                 <w:lang w:bidi="mr-IN"/>
               </w:rPr>
-              <w:t>We did not come across any adverse entry during the search as per the record available on the said site.</w:t>
+              <w:t xml:space="preserve">{{ search_conclusion }}</w:t>
             </w:r>
           </w:p>
         </w:tc>
@@ -6472,7 +4105,7 @@
                 <w:sz w:val="24"/>
                 <w:szCs w:val="24"/>
               </w:rPr>
-              <w:t>NA</w:t>
+              <w:t xml:space="preserve">{{ ulc_status }}</w:t>
             </w:r>
           </w:p>
         </w:tc>
@@ -6585,7 +4218,7 @@
                 <w:sz w:val="24"/>
                 <w:szCs w:val="24"/>
               </w:rPr>
-              <w:t>NA</w:t>
+              <w:t xml:space="preserve">{{ mortgage_approval_status }}</w:t>
             </w:r>
           </w:p>
         </w:tc>
@@ -6814,7 +4447,7 @@
                 <w:sz w:val="24"/>
                 <w:szCs w:val="24"/>
               </w:rPr>
-              <w:t xml:space="preserve">NA </w:t>
+              <w:t xml:space="preserve">{{ mutation_extract_status }}</w:t>
             </w:r>
           </w:p>
         </w:tc>
@@ -6916,8 +4549,7 @@
                 <w:sz w:val="24"/>
                 <w:szCs w:val="24"/>
               </w:rPr>
-              <w:lastRenderedPageBreak/>
-              <w:t xml:space="preserve">NA  </w:t>
+              <w:t xml:space="preserve">{{ occupation_certificate_status }}</w:t>
             </w:r>
           </w:p>
         </w:tc>
@@ -7010,7 +4642,7 @@
                 <w:sz w:val="24"/>
                 <w:szCs w:val="24"/>
               </w:rPr>
-              <w:t xml:space="preserve">NA </w:t>
+              <w:t xml:space="preserve">{{ mortgage_intimation_status }}</w:t>
             </w:r>
           </w:p>
         </w:tc>
@@ -7114,48 +4746,7 @@
                 <w:szCs w:val="24"/>
                 <w:lang w:bidi="mr-IN"/>
               </w:rPr>
-              <w:t xml:space="preserve">After perusing the documents provided, we are of the opinion that the title of </w:t>
-            </w:r>
-            <w:r>
-              <w:rPr>
-                <w:bCs/>
-                <w:color w:val="1F1F1F"/>
-                <w:sz w:val="24"/>
-                <w:szCs w:val="24"/>
-                <w:u w:val="single"/>
-                <w:shd w:val="clear" w:color="auto" w:fill="FFFFFF"/>
-              </w:rPr>
-              <w:t xml:space="preserve">{{ mortgagor_name }} </w:t>
-            </w:r>
-            <w:r>
-              <w:rPr>
-                <w:b w:val="0"/>
-                <w:color w:val="000000"/>
-                <w:sz w:val="24"/>
-                <w:szCs w:val="24"/>
-                <w:lang w:bidi="mr-IN"/>
-              </w:rPr>
-              <w:t xml:space="preserve">to the property in question is legal and marketable, free from any anomalies </w:t>
-            </w:r>
-            <w:r>
-              <w:rPr>
-                <w:bCs/>
-                <w:color w:val="000000"/>
-                <w:sz w:val="24"/>
-                <w:szCs w:val="24"/>
-                <w:lang w:bidi="mr-IN"/>
-              </w:rPr>
-              <w:t xml:space="preserve">SUBJECT TO EXECUTION AND REGISTRATION OF AGREEMENT IN THEIR FAVOUR </w:t>
-            </w:r>
-            <w:r>
-              <w:rPr>
-                <w:b w:val="0"/>
-                <w:color w:val="000000"/>
-                <w:sz w:val="24"/>
-                <w:szCs w:val="24"/>
-                <w:lang w:bidi="mr-IN"/>
-              </w:rPr>
-              <w:t>AND the Bank can accept such property in mortgage as good enforceable security, by obtaining the below mentioned documents in custody.</w:t>
+              <w:t xml:space="preserve">{{ advocate_final_opinion }}</w:t>
             </w:r>
           </w:p>
         </w:tc>
@@ -7613,7 +5204,7 @@
                 <w:sz w:val="24"/>
                 <w:szCs w:val="24"/>
               </w:rPr>
-              <w:t>NONE</w:t>
+              <w:t xml:space="preserve">{% if not documents_post_disbursement %}NONE{% endif %}</w:t>
             </w:r>
           </w:p>
         </w:tc>
@@ -8023,23 +5614,7 @@
           <w:sz w:val="24"/>
           <w:szCs w:val="24"/>
         </w:rPr>
-        <w:t>The Borrower/Mortgagor has a clear and marketable title to the immoveable property/ (</w:t>
-      </w:r>
-      <w:proofErr w:type="spellStart"/>
-      <w:r>
-        <w:rPr>
-          <w:sz w:val="24"/>
-          <w:szCs w:val="24"/>
-        </w:rPr>
-        <w:t>ies</w:t>
-      </w:r>
-      <w:proofErr w:type="spellEnd"/>
-      <w:r>
-        <w:rPr>
-          <w:sz w:val="24"/>
-          <w:szCs w:val="24"/>
-        </w:rPr>
-        <w:t>);</w:t>
+        <w:t xml:space="preserve">{{ declaration_title_statement }}</w:t>
       </w:r>
     </w:p>
     <w:p>
@@ -8060,23 +5635,7 @@
           <w:sz w:val="24"/>
           <w:szCs w:val="24"/>
         </w:rPr>
-        <w:t>The immoveable property/ (</w:t>
-      </w:r>
-      <w:proofErr w:type="spellStart"/>
-      <w:r>
-        <w:rPr>
-          <w:sz w:val="24"/>
-          <w:szCs w:val="24"/>
-        </w:rPr>
-        <w:t>ies</w:t>
-      </w:r>
-      <w:proofErr w:type="spellEnd"/>
-      <w:r>
-        <w:rPr>
-          <w:sz w:val="24"/>
-          <w:szCs w:val="24"/>
-        </w:rPr>
-        <w:t>) can be accepted by the Bank by way of equitable/simple registered mortgage as security for the credit facilities being granted/to be granted by the Bank to the Borrower;</w:t>
+        <w:t xml:space="preserve">{{ declaration_mortgage_statement }}</w:t>
       </w:r>
     </w:p>
     <w:p>
@@ -8223,7 +5782,7 @@
           <w:sz w:val="24"/>
           <w:szCs w:val="24"/>
         </w:rPr>
-        <w:t>Place: Pune</w:t>
+        <w:t xml:space="preserve">Place: {{ advocate_place }}</w:t>
       </w:r>
       <w:r>
         <w:rPr>
@@ -8348,7 +5907,7 @@
           <w:sz w:val="24"/>
           <w:szCs w:val="24"/>
         </w:rPr>
-        <w:t xml:space="preserve">                                                                                                Adv. Dnyanada Dangal</w:t>
+        <w:t xml:space="preserve">                                                                                                Adv. {{ advocate_name }}</w:t>
       </w:r>
     </w:p>
     <w:p>

</xml_diff>